<commit_message>
fix: retake all screenshots with proper authentication
Previous screenshots showed login page due to expired session.
Now: login via API, set localStorage tokens, then navigate to each screen.
All 10 UI screenshots verified at correct authenticated URLs.
DOCX regenerated with 13 embedded images (1.3MB).

Made-with: Cursor
</commit_message>
<xml_diff>
--- a/docs/APPENDIX_FINAL.docx
+++ b/docs/APPENDIX_FINAL.docx
@@ -12,22 +12,10 @@
           <w:color w:val="1F6F43"/>
           <w:sz w:val="56"/>
         </w:rPr>
-        <w:t>נספחים — מערכת Forewise</w:t>
+        <w:t>Forewise</w:t>
       </w:r>
     </w:p>
     <w:p/>
-    <w:p>
-      <w:pPr>
-        <w:jc w:val="center"/>
-      </w:pPr>
-      <w:r>
-        <w:rPr>
-          <w:color w:val="555555"/>
-          <w:sz w:val="26"/>
-        </w:rPr>
-        <w:t>Appendix A — UI Screens  |  Appendix B — Core Processes</w:t>
-      </w:r>
-    </w:p>
     <w:p>
       <w:r>
         <w:br w:type="page"/>
@@ -42,7 +30,7 @@
         <w:rPr>
           <w:color w:val="1F6F43"/>
         </w:rPr>
-        <w:t>נספח א׳ — מסכי מערכת עיקריים</w:t>
+        <w:t>UI Screens</w:t>
       </w:r>
     </w:p>
     <w:p/>
@@ -52,7 +40,7 @@
         <w:jc w:val="right"/>
       </w:pPr>
       <w:r>
-        <w:t>1. מסך התחברות (Login)</w:t>
+        <w:t>1. Login</w:t>
       </w:r>
     </w:p>
     <w:p>
@@ -96,161 +84,51 @@
     </w:p>
     <w:p>
       <w:pPr>
-        <w:jc w:val="center"/>
+        <w:pStyle w:val="Heading3"/>
+        <w:jc w:val="right"/>
       </w:pPr>
       <w:r>
-        <w:rPr>
-          <w:i/>
-          <w:sz w:val="18"/>
-        </w:rPr>
-        <w:t>צילום מסך: דף התחברות</w:t>
+        <w:t>Role</w:t>
       </w:r>
     </w:p>
     <w:p>
       <w:pPr>
-        <w:pStyle w:val="Heading3"/>
         <w:jc w:val="right"/>
+        <w:bidi/>
       </w:pPr>
       <w:r>
-        <w:t>תפקיד משתמש</w:t>
+        <w:rPr>
+          <w:b w:val="0"/>
+          <w:sz w:val="22"/>
+        </w:rPr>
+        <w:t>All users</w:t>
       </w:r>
     </w:p>
     <w:p>
       <w:pPr>
+        <w:pStyle w:val="Heading3"/>
+        <w:jc w:val="right"/>
+      </w:pPr>
+      <w:r>
+        <w:t>Description</w:t>
+      </w:r>
+    </w:p>
+    <w:p>
+      <w:pPr>
         <w:jc w:val="right"/>
         <w:bidi/>
       </w:pPr>
       <w:r>
         <w:rPr>
           <w:b w:val="0"/>
-          <w:i w:val="0"/>
           <w:sz w:val="22"/>
         </w:rPr>
-        <w:t>כל המשתמשים — מנהלי מערכת, מנהלי מרחב, מנהלי אזור, מנהלי עבודה, רכזי הזמנות, מנהלות חשבונות.</w:t>
-      </w:r>
-    </w:p>
-    <w:p>
-      <w:pPr>
-        <w:pStyle w:val="Heading3"/>
-        <w:jc w:val="right"/>
-      </w:pPr>
-      <w:r>
-        <w:t>מטרה</w:t>
-      </w:r>
-    </w:p>
-    <w:p>
-      <w:pPr>
-        <w:jc w:val="right"/>
-        <w:bidi/>
-      </w:pPr>
-      <w:r>
-        <w:rPr>
-          <w:b w:val="0"/>
-          <w:i w:val="0"/>
-          <w:sz w:val="22"/>
-        </w:rPr>
-        <w:t>הכניסה למערכת מבוססת על שם משתמש וסיסמה בלבד — לא על כתובת מייל. לאחר אימות הסיסמה, המערכת מפעילה אימות דו-שלבי (2FA) באמצעות קוד OTP הנשלח למייל המשתמש. ניתן לחלופין לבצע אימות ביומטרי (WebAuthn) — אפשרות זו זמינה למשתמשים שרשמו אמצעי ביומטרי מראש (Touch ID, Face ID, Windows Hello).</w:t>
-      </w:r>
-    </w:p>
-    <w:p>
-      <w:pPr>
-        <w:pStyle w:val="Heading3"/>
-        <w:jc w:val="right"/>
-      </w:pPr>
-      <w:r>
-        <w:t>פעולות עיקריות</w:t>
-      </w:r>
-    </w:p>
-    <w:p>
-      <w:pPr>
-        <w:pStyle w:val="ListBullet"/>
-        <w:jc w:val="right"/>
-        <w:bidi/>
-      </w:pPr>
-      <w:r>
-        <w:rPr>
-          <w:sz w:val="21"/>
-        </w:rPr>
-        <w:t>הזנת שם משתמש וסיסמה</w:t>
-      </w:r>
-    </w:p>
-    <w:p>
-      <w:pPr>
-        <w:pStyle w:val="ListBullet"/>
-        <w:jc w:val="right"/>
-        <w:bidi/>
-      </w:pPr>
-      <w:r>
-        <w:rPr>
-          <w:sz w:val="21"/>
-        </w:rPr>
-        <w:t>אישור OTP שנשלח למייל (2FA חובה)</w:t>
-      </w:r>
-    </w:p>
-    <w:p>
-      <w:pPr>
-        <w:pStyle w:val="ListBullet"/>
-        <w:jc w:val="right"/>
-        <w:bidi/>
-      </w:pPr>
-      <w:r>
-        <w:rPr>
-          <w:sz w:val="21"/>
-        </w:rPr>
-        <w:t>כניסה ביומטרית (אפשרות — אם נרשמה מראש)</w:t>
-      </w:r>
-    </w:p>
-    <w:p>
-      <w:pPr>
-        <w:pStyle w:val="ListBullet"/>
-        <w:jc w:val="right"/>
-        <w:bidi/>
-      </w:pPr>
-      <w:r>
-        <w:rPr>
-          <w:sz w:val="21"/>
-        </w:rPr>
-        <w:t>שכחתי סיסמה — איפוס באמצעות קוד OTP</w:t>
-      </w:r>
-    </w:p>
-    <w:p>
-      <w:pPr>
-        <w:pStyle w:val="Heading3"/>
-        <w:jc w:val="right"/>
-      </w:pPr>
-      <w:r>
-        <w:t>הערות</w:t>
-      </w:r>
-    </w:p>
-    <w:p>
-      <w:pPr>
-        <w:pStyle w:val="ListBullet"/>
-        <w:jc w:val="right"/>
-        <w:bidi/>
-      </w:pPr>
-      <w:r>
-        <w:rPr>
-          <w:sz w:val="21"/>
-        </w:rPr>
-        <w:t>לאחר 5 ניסיונות כושלים — החשבון ננעל אוטומטית ל-15 דקות.</w:t>
-      </w:r>
-    </w:p>
-    <w:p>
-      <w:pPr>
-        <w:pStyle w:val="ListBullet"/>
-        <w:jc w:val="right"/>
-        <w:bidi/>
-      </w:pPr>
-      <w:r>
-        <w:rPr>
-          <w:sz w:val="21"/>
-        </w:rPr>
-        <w:t>בסביבת Production, ממשק ה-API (docs/redoc) חסום לגמרי.</w:t>
+        <w:t>Username + password authentication with 2FA (OTP email) and optional biometric (WebAuthn). Account locks after 5 failed attempts.</w:t>
       </w:r>
     </w:p>
     <w:p>
       <w:r>
-        <w:t>──────────────────────────────────────────────────────────────────────</w:t>
+        <w:t>----------------------------------------------------------------------</w:t>
       </w:r>
     </w:p>
     <w:p>
@@ -259,7 +137,7 @@
         <w:jc w:val="right"/>
       </w:pPr>
       <w:r>
-        <w:t>2. לוח בקרה (Dashboard)</w:t>
+        <w:t>2. Dashboard</w:t>
       </w:r>
     </w:p>
     <w:p>
@@ -303,113 +181,51 @@
     </w:p>
     <w:p>
       <w:pPr>
-        <w:jc w:val="center"/>
+        <w:pStyle w:val="Heading3"/>
+        <w:jc w:val="right"/>
       </w:pPr>
       <w:r>
-        <w:rPr>
-          <w:i/>
-          <w:sz w:val="18"/>
-        </w:rPr>
-        <w:t>צילום מסך: לוח בקרה מנהל מערכת</w:t>
+        <w:t>Role</w:t>
       </w:r>
     </w:p>
     <w:p>
       <w:pPr>
-        <w:pStyle w:val="Heading3"/>
         <w:jc w:val="right"/>
+        <w:bidi/>
       </w:pPr>
       <w:r>
-        <w:t>תפקיד משתמש</w:t>
+        <w:rPr>
+          <w:b w:val="0"/>
+          <w:sz w:val="22"/>
+        </w:rPr>
+        <w:t>Role-specific</w:t>
       </w:r>
     </w:p>
     <w:p>
       <w:pPr>
+        <w:pStyle w:val="Heading3"/>
+        <w:jc w:val="right"/>
+      </w:pPr>
+      <w:r>
+        <w:t>Description</w:t>
+      </w:r>
+    </w:p>
+    <w:p>
+      <w:pPr>
         <w:jc w:val="right"/>
         <w:bidi/>
       </w:pPr>
       <w:r>
         <w:rPr>
           <w:b w:val="0"/>
-          <w:i w:val="0"/>
           <w:sz w:val="22"/>
         </w:rPr>
-        <w:t>כל תפקיד רואה לוח בקרה מותאם — מנהל מערכת רואה מדדים כלל-מערכתיים, מנהל אזור תפעוליים, מנהלת חשבונות כספיים.</w:t>
-      </w:r>
-    </w:p>
-    <w:p>
-      <w:pPr>
-        <w:pStyle w:val="Heading3"/>
-        <w:jc w:val="right"/>
-      </w:pPr>
-      <w:r>
-        <w:t>מטרה</w:t>
-      </w:r>
-    </w:p>
-    <w:p>
-      <w:pPr>
-        <w:jc w:val="right"/>
-        <w:bidi/>
-      </w:pPr>
-      <w:r>
-        <w:rPr>
-          <w:b w:val="0"/>
-          <w:i w:val="0"/>
-          <w:sz w:val="22"/>
-        </w:rPr>
-        <w:t>תצוגה מרכזית של מצב המערכת בזמן אמת — הזמנות פתוחות, דיווחים ממתינים, חריגות תקציב, התראות ופעולות מהירות.</w:t>
-      </w:r>
-    </w:p>
-    <w:p>
-      <w:pPr>
-        <w:pStyle w:val="Heading3"/>
-        <w:jc w:val="right"/>
-      </w:pPr>
-      <w:r>
-        <w:t>פעולות עיקריות</w:t>
-      </w:r>
-    </w:p>
-    <w:p>
-      <w:pPr>
-        <w:pStyle w:val="ListBullet"/>
-        <w:jc w:val="right"/>
-        <w:bidi/>
-      </w:pPr>
-      <w:r>
-        <w:rPr>
-          <w:sz w:val="21"/>
-        </w:rPr>
-        <w:t>צפייה ב-KPI מרכזיים (הזמנות פתוחות, דיווחים ממתינים, חריגות תקציב)</w:t>
-      </w:r>
-    </w:p>
-    <w:p>
-      <w:pPr>
-        <w:pStyle w:val="ListBullet"/>
-        <w:jc w:val="right"/>
-        <w:bidi/>
-      </w:pPr>
-      <w:r>
-        <w:rPr>
-          <w:sz w:val="21"/>
-        </w:rPr>
-        <w:t>ניווט מהיר לפעולות (יצירת הזמנה, אישור דיווח, צפייה בחשבוניות)</w:t>
-      </w:r>
-    </w:p>
-    <w:p>
-      <w:pPr>
-        <w:pStyle w:val="ListBullet"/>
-        <w:jc w:val="right"/>
-        <w:bidi/>
-      </w:pPr>
-      <w:r>
-        <w:rPr>
-          <w:sz w:val="21"/>
-        </w:rPr>
-        <w:t>צפייה בפעילות אחרונה ובהתראות</w:t>
+        <w:t>Central KPI view: open orders, pending reports, budget alerts. Each role sees scoped data for their region/area only.</w:t>
       </w:r>
     </w:p>
     <w:p>
       <w:r>
-        <w:t>──────────────────────────────────────────────────────────────────────</w:t>
+        <w:t>----------------------------------------------------------------------</w:t>
       </w:r>
     </w:p>
     <w:p>
@@ -418,7 +234,7 @@
         <w:jc w:val="right"/>
       </w:pPr>
       <w:r>
-        <w:t>3. רשימת פרויקטים / סביבת עבודה</w:t>
+        <w:t>3. Projects</w:t>
       </w:r>
     </w:p>
     <w:p>
@@ -437,411 +253,7 @@
               <a:graphicData uri="http://schemas.openxmlformats.org/drawingml/2006/picture">
                 <pic:pic>
                   <pic:nvPicPr>
-                    <pic:cNvPr id="0" name="dashboard.png"/>
-                    <pic:cNvPicPr/>
-                  </pic:nvPicPr>
-                  <pic:blipFill>
-                    <a:blip r:embed="rId10"/>
-                    <a:stretch>
-                      <a:fillRect/>
-                    </a:stretch>
-                  </pic:blipFill>
-                  <pic:spPr>
-                    <a:xfrm>
-                      <a:off x="0" y="0"/>
-                      <a:ext cx="5029200" cy="3143250"/>
-                    </a:xfrm>
-                    <a:prstGeom prst="rect"/>
-                  </pic:spPr>
-                </pic:pic>
-              </a:graphicData>
-            </a:graphic>
-          </wp:inline>
-        </w:drawing>
-      </w:r>
-    </w:p>
-    <w:p>
-      <w:pPr>
-        <w:jc w:val="center"/>
-      </w:pPr>
-      <w:r>
-        <w:rPr>
-          <w:i/>
-          <w:sz w:val="18"/>
-        </w:rPr>
-        <w:t>צילום מסך: רשימת פרויקטים</w:t>
-      </w:r>
-    </w:p>
-    <w:p>
-      <w:pPr>
-        <w:pStyle w:val="Heading3"/>
-        <w:jc w:val="right"/>
-      </w:pPr>
-      <w:r>
-        <w:t>תפקיד משתמש</w:t>
-      </w:r>
-    </w:p>
-    <w:p>
-      <w:pPr>
-        <w:jc w:val="right"/>
-        <w:bidi/>
-      </w:pPr>
-      <w:r>
-        <w:rPr>
-          <w:b w:val="0"/>
-          <w:i w:val="0"/>
-          <w:sz w:val="22"/>
-        </w:rPr>
-        <w:t>מנהלי אזור, מנהלי עבודה, מנהלי מרחב.</w:t>
-      </w:r>
-    </w:p>
-    <w:p>
-      <w:pPr>
-        <w:pStyle w:val="Heading3"/>
-        <w:jc w:val="right"/>
-      </w:pPr>
-      <w:r>
-        <w:t>מטרה</w:t>
-      </w:r>
-    </w:p>
-    <w:p>
-      <w:pPr>
-        <w:jc w:val="right"/>
-        <w:bidi/>
-      </w:pPr>
-      <w:r>
-        <w:rPr>
-          <w:b w:val="0"/>
-          <w:i w:val="0"/>
-          <w:sz w:val="22"/>
-        </w:rPr>
-        <w:t>ניהול פרויקטים פעילים — צפייה בסטטוס, תקציב, הזמנות פעילות ודיווחי עבודה. סביבת העבודה כוללת לשוניות: סקירה כללית, הזמנות עבודה, כלים בפרויקט ומפה.</w:t>
-      </w:r>
-    </w:p>
-    <w:p>
-      <w:r>
-        <w:t>──────────────────────────────────────────────────────────────────────</w:t>
-      </w:r>
-    </w:p>
-    <w:p>
-      <w:pPr>
-        <w:pStyle w:val="Heading2"/>
-        <w:jc w:val="right"/>
-      </w:pPr>
-      <w:r>
-        <w:t>4. יצירת הזמנת עבודה</w:t>
-      </w:r>
-    </w:p>
-    <w:p>
-      <w:pPr>
-        <w:jc w:val="center"/>
-      </w:pPr>
-      <w:r>
-        <w:drawing>
-          <wp:inline xmlns:a="http://schemas.openxmlformats.org/drawingml/2006/main" xmlns:pic="http://schemas.openxmlformats.org/drawingml/2006/picture">
-            <wp:extent cx="5029200" cy="3143250"/>
-            <wp:docPr id="4" name="Picture 4"/>
-            <wp:cNvGraphicFramePr>
-              <a:graphicFrameLocks noChangeAspect="1"/>
-            </wp:cNvGraphicFramePr>
-            <a:graphic>
-              <a:graphicData uri="http://schemas.openxmlformats.org/drawingml/2006/picture">
-                <pic:pic>
-                  <pic:nvPicPr>
-                    <pic:cNvPr id="0" name="dashboard.png"/>
-                    <pic:cNvPicPr/>
-                  </pic:nvPicPr>
-                  <pic:blipFill>
-                    <a:blip r:embed="rId10"/>
-                    <a:stretch>
-                      <a:fillRect/>
-                    </a:stretch>
-                  </pic:blipFill>
-                  <pic:spPr>
-                    <a:xfrm>
-                      <a:off x="0" y="0"/>
-                      <a:ext cx="5029200" cy="3143250"/>
-                    </a:xfrm>
-                    <a:prstGeom prst="rect"/>
-                  </pic:spPr>
-                </pic:pic>
-              </a:graphicData>
-            </a:graphic>
-          </wp:inline>
-        </w:drawing>
-      </w:r>
-    </w:p>
-    <w:p>
-      <w:pPr>
-        <w:jc w:val="center"/>
-      </w:pPr>
-      <w:r>
-        <w:rPr>
-          <w:i/>
-          <w:sz w:val="18"/>
-        </w:rPr>
-        <w:t>צילום מסך: טופס יצירת הזמנה</w:t>
-      </w:r>
-    </w:p>
-    <w:p>
-      <w:pPr>
-        <w:pStyle w:val="Heading3"/>
-        <w:jc w:val="right"/>
-      </w:pPr>
-      <w:r>
-        <w:t>תפקיד משתמש</w:t>
-      </w:r>
-    </w:p>
-    <w:p>
-      <w:pPr>
-        <w:jc w:val="right"/>
-        <w:bidi/>
-      </w:pPr>
-      <w:r>
-        <w:rPr>
-          <w:b w:val="0"/>
-          <w:i w:val="0"/>
-          <w:sz w:val="22"/>
-        </w:rPr>
-        <w:t>מנהל עבודה, מנהל אזור.</w:t>
-      </w:r>
-    </w:p>
-    <w:p>
-      <w:pPr>
-        <w:pStyle w:val="Heading3"/>
-        <w:jc w:val="right"/>
-      </w:pPr>
-      <w:r>
-        <w:t>מטרה</w:t>
-      </w:r>
-    </w:p>
-    <w:p>
-      <w:pPr>
-        <w:jc w:val="right"/>
-        <w:bidi/>
-      </w:pPr>
-      <w:r>
-        <w:rPr>
-          <w:b w:val="0"/>
-          <w:i w:val="0"/>
-          <w:sz w:val="22"/>
-        </w:rPr>
-        <w:t>יצירת הזמנה חדשה עבור פרויקט — בחירת סוג ציוד, שיטת הקצאה (סבב הוגן / בחירה ידנית), תאריכי עבודה.</w:t>
-      </w:r>
-    </w:p>
-    <w:p>
-      <w:pPr>
-        <w:pStyle w:val="Heading3"/>
-        <w:jc w:val="right"/>
-      </w:pPr>
-      <w:r>
-        <w:t>הערות</w:t>
-      </w:r>
-    </w:p>
-    <w:p>
-      <w:pPr>
-        <w:jc w:val="right"/>
-        <w:bidi/>
-      </w:pPr>
-      <w:r>
-        <w:rPr>
-          <w:b w:val="0"/>
-          <w:i w:val="0"/>
-          <w:sz w:val="22"/>
-        </w:rPr>
-        <w:t>המערכת מוודאת קיום תקציב זמין לפני יצירת ההזמנה. סוג הכלי מאומת מול קטגוריות קיימות.</w:t>
-      </w:r>
-    </w:p>
-    <w:p>
-      <w:r>
-        <w:t>──────────────────────────────────────────────────────────────────────</w:t>
-      </w:r>
-    </w:p>
-    <w:p>
-      <w:pPr>
-        <w:pStyle w:val="Heading2"/>
-        <w:jc w:val="right"/>
-      </w:pPr>
-      <w:r>
-        <w:t>5. ניהול הזמנות — מתאם הזמנות</w:t>
-      </w:r>
-    </w:p>
-    <w:p>
-      <w:pPr>
-        <w:jc w:val="center"/>
-      </w:pPr>
-      <w:r>
-        <w:drawing>
-          <wp:inline xmlns:a="http://schemas.openxmlformats.org/drawingml/2006/main" xmlns:pic="http://schemas.openxmlformats.org/drawingml/2006/picture">
-            <wp:extent cx="5029200" cy="3143250"/>
-            <wp:docPr id="5" name="Picture 5"/>
-            <wp:cNvGraphicFramePr>
-              <a:graphicFrameLocks noChangeAspect="1"/>
-            </wp:cNvGraphicFramePr>
-            <a:graphic>
-              <a:graphicData uri="http://schemas.openxmlformats.org/drawingml/2006/picture">
-                <pic:pic>
-                  <pic:nvPicPr>
-                    <pic:cNvPr id="0" name="dashboard.png"/>
-                    <pic:cNvPicPr/>
-                  </pic:nvPicPr>
-                  <pic:blipFill>
-                    <a:blip r:embed="rId10"/>
-                    <a:stretch>
-                      <a:fillRect/>
-                    </a:stretch>
-                  </pic:blipFill>
-                  <pic:spPr>
-                    <a:xfrm>
-                      <a:off x="0" y="0"/>
-                      <a:ext cx="5029200" cy="3143250"/>
-                    </a:xfrm>
-                    <a:prstGeom prst="rect"/>
-                  </pic:spPr>
-                </pic:pic>
-              </a:graphicData>
-            </a:graphic>
-          </wp:inline>
-        </w:drawing>
-      </w:r>
-    </w:p>
-    <w:p>
-      <w:pPr>
-        <w:jc w:val="center"/>
-      </w:pPr>
-      <w:r>
-        <w:rPr>
-          <w:i/>
-          <w:sz w:val="18"/>
-        </w:rPr>
-        <w:t>צילום מסך: ניהול הזמנות</w:t>
-      </w:r>
-    </w:p>
-    <w:p>
-      <w:pPr>
-        <w:pStyle w:val="Heading3"/>
-        <w:jc w:val="right"/>
-      </w:pPr>
-      <w:r>
-        <w:t>תפקיד משתמש</w:t>
-      </w:r>
-    </w:p>
-    <w:p>
-      <w:pPr>
-        <w:jc w:val="right"/>
-        <w:bidi/>
-      </w:pPr>
-      <w:r>
-        <w:rPr>
-          <w:b w:val="0"/>
-          <w:i w:val="0"/>
-          <w:sz w:val="22"/>
-        </w:rPr>
-        <w:t>רכז הזמנות (Order Coordinator).</w:t>
-      </w:r>
-    </w:p>
-    <w:p>
-      <w:pPr>
-        <w:pStyle w:val="Heading3"/>
-        <w:jc w:val="right"/>
-      </w:pPr>
-      <w:r>
-        <w:t>מטרה</w:t>
-      </w:r>
-    </w:p>
-    <w:p>
-      <w:pPr>
-        <w:jc w:val="right"/>
-        <w:bidi/>
-      </w:pPr>
-      <w:r>
-        <w:rPr>
-          <w:b w:val="0"/>
-          <w:i w:val="0"/>
-          <w:sz w:val="22"/>
-        </w:rPr>
-        <w:t>ניהול תור הזמנות — שליחה לספק, מעקב אחר תגובות, אישור סופי.</w:t>
-      </w:r>
-    </w:p>
-    <w:p>
-      <w:pPr>
-        <w:pStyle w:val="Heading3"/>
-        <w:jc w:val="right"/>
-      </w:pPr>
-      <w:r>
-        <w:t>פעולות עיקריות</w:t>
-      </w:r>
-    </w:p>
-    <w:p>
-      <w:pPr>
-        <w:pStyle w:val="ListBullet"/>
-        <w:jc w:val="right"/>
-        <w:bidi/>
-      </w:pPr>
-      <w:r>
-        <w:rPr>
-          <w:sz w:val="21"/>
-        </w:rPr>
-        <w:t>שליחת הזמנה לספק (יצירת קישור פורטל)</w:t>
-      </w:r>
-    </w:p>
-    <w:p>
-      <w:pPr>
-        <w:pStyle w:val="ListBullet"/>
-        <w:jc w:val="right"/>
-        <w:bidi/>
-      </w:pPr>
-      <w:r>
-        <w:rPr>
-          <w:sz w:val="21"/>
-        </w:rPr>
-        <w:t>מעקב אחר תגובת ספק (אישור / דחייה)</w:t>
-      </w:r>
-    </w:p>
-    <w:p>
-      <w:pPr>
-        <w:pStyle w:val="ListBullet"/>
-        <w:jc w:val="right"/>
-        <w:bidi/>
-      </w:pPr>
-      <w:r>
-        <w:rPr>
-          <w:sz w:val="21"/>
-        </w:rPr>
-        <w:t>אישור סופי (coordinator-approve) + מעבר לספק הבא אם נדחה</w:t>
-      </w:r>
-    </w:p>
-    <w:p>
-      <w:r>
-        <w:t>──────────────────────────────────────────────────────────────────────</w:t>
-      </w:r>
-    </w:p>
-    <w:p>
-      <w:pPr>
-        <w:pStyle w:val="Heading2"/>
-        <w:jc w:val="right"/>
-      </w:pPr>
-      <w:r>
-        <w:t>6. פורטל ספקים</w:t>
-      </w:r>
-    </w:p>
-    <w:p>
-      <w:pPr>
-        <w:jc w:val="center"/>
-      </w:pPr>
-      <w:r>
-        <w:drawing>
-          <wp:inline xmlns:a="http://schemas.openxmlformats.org/drawingml/2006/main" xmlns:pic="http://schemas.openxmlformats.org/drawingml/2006/picture">
-            <wp:extent cx="5029200" cy="3143250"/>
-            <wp:docPr id="6" name="Picture 6"/>
-            <wp:cNvGraphicFramePr>
-              <a:graphicFrameLocks noChangeAspect="1"/>
-            </wp:cNvGraphicFramePr>
-            <a:graphic>
-              <a:graphicData uri="http://schemas.openxmlformats.org/drawingml/2006/picture">
-                <pic:pic>
-                  <pic:nvPicPr>
-                    <pic:cNvPr id="0" name="supplier_portal.png"/>
+                    <pic:cNvPr id="0" name="projects.png"/>
                     <pic:cNvPicPr/>
                   </pic:nvPicPr>
                   <pic:blipFill>
@@ -866,113 +278,51 @@
     </w:p>
     <w:p>
       <w:pPr>
-        <w:jc w:val="center"/>
+        <w:pStyle w:val="Heading3"/>
+        <w:jc w:val="right"/>
       </w:pPr>
       <w:r>
-        <w:rPr>
-          <w:i/>
-          <w:sz w:val="18"/>
-        </w:rPr>
-        <w:t>צילום מסך: פורטל ספקים (גישה חיצונית)</w:t>
+        <w:t>Role</w:t>
       </w:r>
     </w:p>
     <w:p>
       <w:pPr>
-        <w:pStyle w:val="Heading3"/>
         <w:jc w:val="right"/>
+        <w:bidi/>
       </w:pPr>
       <w:r>
-        <w:t>תפקיד משתמש</w:t>
+        <w:rPr>
+          <w:b w:val="0"/>
+          <w:sz w:val="22"/>
+        </w:rPr>
+        <w:t>Area/Work/Region managers</w:t>
       </w:r>
     </w:p>
     <w:p>
       <w:pPr>
+        <w:pStyle w:val="Heading3"/>
+        <w:jc w:val="right"/>
+      </w:pPr>
+      <w:r>
+        <w:t>Description</w:t>
+      </w:r>
+    </w:p>
+    <w:p>
+      <w:pPr>
         <w:jc w:val="right"/>
         <w:bidi/>
       </w:pPr>
       <w:r>
         <w:rPr>
           <w:b w:val="0"/>
-          <w:i w:val="0"/>
           <w:sz w:val="22"/>
         </w:rPr>
-        <w:t>ספק חיצוני — גישה באמצעות קישור חד-פעמי בלבד, ללא התחברות למערכת.</w:t>
-      </w:r>
-    </w:p>
-    <w:p>
-      <w:pPr>
-        <w:pStyle w:val="Heading3"/>
-        <w:jc w:val="right"/>
-      </w:pPr>
-      <w:r>
-        <w:t>מטרה</w:t>
-      </w:r>
-    </w:p>
-    <w:p>
-      <w:pPr>
-        <w:jc w:val="right"/>
-        <w:bidi/>
-      </w:pPr>
-      <w:r>
-        <w:rPr>
-          <w:b w:val="0"/>
-          <w:i w:val="0"/>
-          <w:sz w:val="22"/>
-        </w:rPr>
-        <w:t>ספק מקבל קישור במייל עם token חד-פעמי (תוקף 3 שעות). בפורטל הספק רואה פרטי הזמנה ויכול לאשר עם בחירת כלי, או לדחות.</w:t>
-      </w:r>
-    </w:p>
-    <w:p>
-      <w:pPr>
-        <w:pStyle w:val="Heading3"/>
-        <w:jc w:val="right"/>
-      </w:pPr>
-      <w:r>
-        <w:t>הערות</w:t>
-      </w:r>
-    </w:p>
-    <w:p>
-      <w:pPr>
-        <w:pStyle w:val="ListBullet"/>
-        <w:jc w:val="right"/>
-        <w:bidi/>
-      </w:pPr>
-      <w:r>
-        <w:rPr>
-          <w:sz w:val="21"/>
-        </w:rPr>
-        <w:t>קישור שפג תוקפו מציג הודעה ברורה.</w:t>
-      </w:r>
-    </w:p>
-    <w:p>
-      <w:pPr>
-        <w:pStyle w:val="ListBullet"/>
-        <w:jc w:val="right"/>
-        <w:bidi/>
-      </w:pPr>
-      <w:r>
-        <w:rPr>
-          <w:sz w:val="21"/>
-        </w:rPr>
-        <w:t>לא ניתן לאשר/לדחות פעמיים (מניעת כפילות).</w:t>
-      </w:r>
-    </w:p>
-    <w:p>
-      <w:pPr>
-        <w:pStyle w:val="ListBullet"/>
-        <w:jc w:val="right"/>
-        <w:bidi/>
-      </w:pPr>
-      <w:r>
-        <w:rPr>
-          <w:sz w:val="21"/>
-        </w:rPr>
-        <w:t>הפורטל מותאם לנייד.</w:t>
+        <w:t>Active project management with workspace tabs: overview, work orders, equipment, forest map (Leaflet + PostGIS).</w:t>
       </w:r>
     </w:p>
     <w:p>
       <w:r>
-        <w:t>──────────────────────────────────────────────────────────────────────</w:t>
+        <w:t>----------------------------------------------------------------------</w:t>
       </w:r>
     </w:p>
     <w:p>
@@ -981,7 +331,7 @@
         <w:jc w:val="right"/>
       </w:pPr>
       <w:r>
-        <w:t>7. אימות כלי לפי מספר רישוי</w:t>
+        <w:t>4. Create Work Order</w:t>
       </w:r>
     </w:p>
     <w:p>
@@ -992,7 +342,7 @@
         <w:drawing>
           <wp:inline xmlns:a="http://schemas.openxmlformats.org/drawingml/2006/main" xmlns:pic="http://schemas.openxmlformats.org/drawingml/2006/picture">
             <wp:extent cx="5029200" cy="3143250"/>
-            <wp:docPr id="7" name="Picture 7"/>
+            <wp:docPr id="4" name="Picture 4"/>
             <wp:cNvGraphicFramePr>
               <a:graphicFrameLocks noChangeAspect="1"/>
             </wp:cNvGraphicFramePr>
@@ -1000,11 +350,11 @@
               <a:graphicData uri="http://schemas.openxmlformats.org/drawingml/2006/picture">
                 <pic:pic>
                   <pic:nvPicPr>
-                    <pic:cNvPr id="0" name="dashboard.png"/>
+                    <pic:cNvPr id="0" name="create_work_order.png"/>
                     <pic:cNvPicPr/>
                   </pic:nvPicPr>
                   <pic:blipFill>
-                    <a:blip r:embed="rId10"/>
+                    <a:blip r:embed="rId12"/>
                     <a:stretch>
                       <a:fillRect/>
                     </a:stretch>
@@ -1025,88 +375,51 @@
     </w:p>
     <w:p>
       <w:pPr>
-        <w:jc w:val="center"/>
+        <w:pStyle w:val="Heading3"/>
+        <w:jc w:val="right"/>
       </w:pPr>
       <w:r>
-        <w:rPr>
-          <w:i/>
-          <w:sz w:val="18"/>
-        </w:rPr>
-        <w:t>צילום מסך: אימות כלי במספר רישוי</w:t>
+        <w:t>Role</w:t>
       </w:r>
     </w:p>
     <w:p>
       <w:pPr>
-        <w:pStyle w:val="Heading3"/>
         <w:jc w:val="right"/>
+        <w:bidi/>
       </w:pPr>
       <w:r>
-        <w:t>תפקיד משתמש</w:t>
+        <w:rPr>
+          <w:b w:val="0"/>
+          <w:sz w:val="22"/>
+        </w:rPr>
+        <w:t>Work Manager, Area Manager</w:t>
       </w:r>
     </w:p>
     <w:p>
       <w:pPr>
+        <w:pStyle w:val="Heading3"/>
+        <w:jc w:val="right"/>
+      </w:pPr>
+      <w:r>
+        <w:t>Description</w:t>
+      </w:r>
+    </w:p>
+    <w:p>
+      <w:pPr>
         <w:jc w:val="right"/>
         <w:bidi/>
       </w:pPr>
       <w:r>
         <w:rPr>
           <w:b w:val="0"/>
-          <w:i w:val="0"/>
           <w:sz w:val="22"/>
         </w:rPr>
-        <w:t>מנהל עבודה (שטח).</w:t>
-      </w:r>
-    </w:p>
-    <w:p>
-      <w:pPr>
-        <w:pStyle w:val="Heading3"/>
-        <w:jc w:val="right"/>
-      </w:pPr>
-      <w:r>
-        <w:t>מטרה</w:t>
-      </w:r>
-    </w:p>
-    <w:p>
-      <w:pPr>
-        <w:jc w:val="right"/>
-        <w:bidi/>
-      </w:pPr>
-      <w:r>
-        <w:rPr>
-          <w:b w:val="0"/>
-          <w:i w:val="0"/>
-          <w:sz w:val="22"/>
-        </w:rPr>
-        <w:t>אימות שהכלי שהגיע תואם את ההזמנה — הכלי קיים, שייך לספק הנכון, ההזמנה מאושרת.</w:t>
-      </w:r>
-    </w:p>
-    <w:p>
-      <w:pPr>
-        <w:pStyle w:val="Heading3"/>
-        <w:jc w:val="right"/>
-      </w:pPr>
-      <w:r>
-        <w:t>הערות</w:t>
-      </w:r>
-    </w:p>
-    <w:p>
-      <w:pPr>
-        <w:jc w:val="right"/>
-        <w:bidi/>
-      </w:pPr>
-      <w:r>
-        <w:rPr>
-          <w:b w:val="0"/>
-          <w:i w:val="0"/>
-          <w:sz w:val="22"/>
-        </w:rPr>
-        <w:t>אם הכלי שייך לספק שונה מהמאושר — מוצגת אזהרה. תומך בעבודה אופליין עם סנכרון אוטומטי.</w:t>
+        <w:t>New order form: equipment type, allocation method (fair rotation / forced), dates. Budget validated before creation.</w:t>
       </w:r>
     </w:p>
     <w:p>
       <w:r>
-        <w:t>──────────────────────────────────────────────────────────────────────</w:t>
+        <w:t>----------------------------------------------------------------------</w:t>
       </w:r>
     </w:p>
     <w:p>
@@ -1115,7 +428,7 @@
         <w:jc w:val="right"/>
       </w:pPr>
       <w:r>
-        <w:t>8. דיווח שעות עבודה</w:t>
+        <w:t>5. Orders Management</w:t>
       </w:r>
     </w:p>
     <w:p>
@@ -1126,7 +439,7 @@
         <w:drawing>
           <wp:inline xmlns:a="http://schemas.openxmlformats.org/drawingml/2006/main" xmlns:pic="http://schemas.openxmlformats.org/drawingml/2006/picture">
             <wp:extent cx="5029200" cy="3143250"/>
-            <wp:docPr id="8" name="Picture 8"/>
+            <wp:docPr id="5" name="Picture 5"/>
             <wp:cNvGraphicFramePr>
               <a:graphicFrameLocks noChangeAspect="1"/>
             </wp:cNvGraphicFramePr>
@@ -1134,11 +447,11 @@
               <a:graphicData uri="http://schemas.openxmlformats.org/drawingml/2006/picture">
                 <pic:pic>
                   <pic:nvPicPr>
-                    <pic:cNvPr id="0" name="dashboard.png"/>
+                    <pic:cNvPr id="0" name="orders_management.png"/>
                     <pic:cNvPicPr/>
                   </pic:nvPicPr>
                   <pic:blipFill>
-                    <a:blip r:embed="rId10"/>
+                    <a:blip r:embed="rId13"/>
                     <a:stretch>
                       <a:fillRect/>
                     </a:stretch>
@@ -1159,65 +472,51 @@
     </w:p>
     <w:p>
       <w:pPr>
-        <w:jc w:val="center"/>
+        <w:pStyle w:val="Heading3"/>
+        <w:jc w:val="right"/>
       </w:pPr>
       <w:r>
-        <w:rPr>
-          <w:i/>
-          <w:sz w:val="18"/>
-        </w:rPr>
-        <w:t>צילום מסך: סביבת עבודה ודיווח שעות</w:t>
+        <w:t>Role</w:t>
       </w:r>
     </w:p>
     <w:p>
       <w:pPr>
-        <w:pStyle w:val="Heading3"/>
         <w:jc w:val="right"/>
+        <w:bidi/>
       </w:pPr>
       <w:r>
-        <w:t>תפקיד משתמש</w:t>
+        <w:rPr>
+          <w:b w:val="0"/>
+          <w:sz w:val="22"/>
+        </w:rPr>
+        <w:t>Order Coordinator</w:t>
       </w:r>
     </w:p>
     <w:p>
       <w:pPr>
+        <w:pStyle w:val="Heading3"/>
+        <w:jc w:val="right"/>
+      </w:pPr>
+      <w:r>
+        <w:t>Description</w:t>
+      </w:r>
+    </w:p>
+    <w:p>
+      <w:pPr>
         <w:jc w:val="right"/>
         <w:bidi/>
       </w:pPr>
       <w:r>
         <w:rPr>
           <w:b w:val="0"/>
-          <w:i w:val="0"/>
           <w:sz w:val="22"/>
         </w:rPr>
-        <w:t>מנהל עבודה.</w:t>
-      </w:r>
-    </w:p>
-    <w:p>
-      <w:pPr>
-        <w:pStyle w:val="Heading3"/>
-        <w:jc w:val="right"/>
-      </w:pPr>
-      <w:r>
-        <w:t>מטרה</w:t>
-      </w:r>
-    </w:p>
-    <w:p>
-      <w:pPr>
-        <w:jc w:val="right"/>
-        <w:bidi/>
-      </w:pPr>
-      <w:r>
-        <w:rPr>
-          <w:b w:val="0"/>
-          <w:i w:val="0"/>
-          <w:sz w:val="22"/>
-        </w:rPr>
-        <w:t>דיווח שעות עבודה בשטח — שעת התחלה, שעת סיום, הפסקות, תיאור עבודה. הדיווח מחושב אוטומטית (שעות נטו, עלות לפי תעריף).</w:t>
+        <w:t>Order queue: send to supplier, track responses, final approval. Handles rotation to next supplier on rejection.</w:t>
       </w:r>
     </w:p>
     <w:p>
       <w:r>
-        <w:t>──────────────────────────────────────────────────────────────────────</w:t>
+        <w:t>----------------------------------------------------------------------</w:t>
       </w:r>
     </w:p>
     <w:p>
@@ -1226,7 +525,7 @@
         <w:jc w:val="right"/>
       </w:pPr>
       <w:r>
-        <w:t>9. אישור דיווחים — מנהלת חשבונות</w:t>
+        <w:t>6. Supplier Portal</w:t>
       </w:r>
     </w:p>
     <w:p>
@@ -1237,7 +536,7 @@
         <w:drawing>
           <wp:inline xmlns:a="http://schemas.openxmlformats.org/drawingml/2006/main" xmlns:pic="http://schemas.openxmlformats.org/drawingml/2006/picture">
             <wp:extent cx="5029200" cy="3143250"/>
-            <wp:docPr id="9" name="Picture 9"/>
+            <wp:docPr id="6" name="Picture 6"/>
             <wp:cNvGraphicFramePr>
               <a:graphicFrameLocks noChangeAspect="1"/>
             </wp:cNvGraphicFramePr>
@@ -1245,11 +544,11 @@
               <a:graphicData uri="http://schemas.openxmlformats.org/drawingml/2006/picture">
                 <pic:pic>
                   <pic:nvPicPr>
-                    <pic:cNvPr id="0" name="dashboard.png"/>
+                    <pic:cNvPr id="0" name="supplier_portal.png"/>
                     <pic:cNvPicPr/>
                   </pic:nvPicPr>
                   <pic:blipFill>
-                    <a:blip r:embed="rId10"/>
+                    <a:blip r:embed="rId14"/>
                     <a:stretch>
                       <a:fillRect/>
                     </a:stretch>
@@ -1270,88 +569,51 @@
     </w:p>
     <w:p>
       <w:pPr>
-        <w:jc w:val="center"/>
+        <w:pStyle w:val="Heading3"/>
+        <w:jc w:val="right"/>
       </w:pPr>
       <w:r>
-        <w:rPr>
-          <w:i/>
-          <w:sz w:val="18"/>
-        </w:rPr>
-        <w:t>צילום מסך: תיבת אישור חשבונאית</w:t>
+        <w:t>Role</w:t>
       </w:r>
     </w:p>
     <w:p>
       <w:pPr>
-        <w:pStyle w:val="Heading3"/>
         <w:jc w:val="right"/>
+        <w:bidi/>
       </w:pPr>
       <w:r>
-        <w:t>תפקיד משתמש</w:t>
+        <w:rPr>
+          <w:b w:val="0"/>
+          <w:sz w:val="22"/>
+        </w:rPr>
+        <w:t>External supplier (token-based)</w:t>
       </w:r>
     </w:p>
     <w:p>
       <w:pPr>
+        <w:pStyle w:val="Heading3"/>
+        <w:jc w:val="right"/>
+      </w:pPr>
+      <w:r>
+        <w:t>Description</w:t>
+      </w:r>
+    </w:p>
+    <w:p>
+      <w:pPr>
         <w:jc w:val="right"/>
         <w:bidi/>
       </w:pPr>
       <w:r>
         <w:rPr>
           <w:b w:val="0"/>
-          <w:i w:val="0"/>
           <w:sz w:val="22"/>
         </w:rPr>
-        <w:t>מנהלת חשבונות.</w:t>
-      </w:r>
-    </w:p>
-    <w:p>
-      <w:pPr>
-        <w:pStyle w:val="Heading3"/>
-        <w:jc w:val="right"/>
-      </w:pPr>
-      <w:r>
-        <w:t>מטרה</w:t>
-      </w:r>
-    </w:p>
-    <w:p>
-      <w:pPr>
-        <w:jc w:val="right"/>
-        <w:bidi/>
-      </w:pPr>
-      <w:r>
-        <w:rPr>
-          <w:b w:val="0"/>
-          <w:i w:val="0"/>
-          <w:sz w:val="22"/>
-        </w:rPr>
-        <w:t>תיבת עבודה כספית — סקירה ואישור דיווחי שעות שהוגשו, עם סינון לפי פרויקט, ספק ותאריך.</w:t>
-      </w:r>
-    </w:p>
-    <w:p>
-      <w:pPr>
-        <w:pStyle w:val="Heading3"/>
-        <w:jc w:val="right"/>
-      </w:pPr>
-      <w:r>
-        <w:t>הערות</w:t>
-      </w:r>
-    </w:p>
-    <w:p>
-      <w:pPr>
-        <w:jc w:val="right"/>
-        <w:bidi/>
-      </w:pPr>
-      <w:r>
-        <w:rPr>
-          <w:b w:val="0"/>
-          <w:i w:val="0"/>
-          <w:sz w:val="22"/>
-        </w:rPr>
-        <w:t>מנהלת חשבונות לא יכולה לאשר דיווח שיצרה בעצמה (self-approval blocked). גישה מוגבלת לאזור שלה בלבד.</w:t>
+        <w:t>Suppliers receive a time-limited link (3h token). They accept with equipment selection or reject with reason. No system login required.</w:t>
       </w:r>
     </w:p>
     <w:p>
       <w:r>
-        <w:t>──────────────────────────────────────────────────────────────────────</w:t>
+        <w:t>----------------------------------------------------------------------</w:t>
       </w:r>
     </w:p>
     <w:p>
@@ -1360,7 +622,7 @@
         <w:jc w:val="right"/>
       </w:pPr>
       <w:r>
-        <w:t>10. חשבוניות</w:t>
+        <w:t>7. Equipment Validation</w:t>
       </w:r>
     </w:p>
     <w:p>
@@ -1371,7 +633,7 @@
         <w:drawing>
           <wp:inline xmlns:a="http://schemas.openxmlformats.org/drawingml/2006/main" xmlns:pic="http://schemas.openxmlformats.org/drawingml/2006/picture">
             <wp:extent cx="5029200" cy="3143250"/>
-            <wp:docPr id="10" name="Picture 10"/>
+            <wp:docPr id="7" name="Picture 7"/>
             <wp:cNvGraphicFramePr>
               <a:graphicFrameLocks noChangeAspect="1"/>
             </wp:cNvGraphicFramePr>
@@ -1379,11 +641,11 @@
               <a:graphicData uri="http://schemas.openxmlformats.org/drawingml/2006/picture">
                 <pic:pic>
                   <pic:nvPicPr>
-                    <pic:cNvPr id="0" name="dashboard.png"/>
+                    <pic:cNvPr id="0" name="equipment_validation.png"/>
                     <pic:cNvPicPr/>
                   </pic:nvPicPr>
                   <pic:blipFill>
-                    <a:blip r:embed="rId10"/>
+                    <a:blip r:embed="rId15"/>
                     <a:stretch>
                       <a:fillRect/>
                     </a:stretch>
@@ -1404,60 +666,121 @@
     </w:p>
     <w:p>
       <w:pPr>
-        <w:jc w:val="center"/>
+        <w:pStyle w:val="Heading3"/>
+        <w:jc w:val="right"/>
       </w:pPr>
       <w:r>
-        <w:rPr>
-          <w:i/>
-          <w:sz w:val="18"/>
-        </w:rPr>
-        <w:t>צילום מסך: ניהול חשבוניות</w:t>
+        <w:t>Role</w:t>
       </w:r>
     </w:p>
     <w:p>
       <w:pPr>
-        <w:pStyle w:val="Heading3"/>
         <w:jc w:val="right"/>
+        <w:bidi/>
       </w:pPr>
       <w:r>
-        <w:t>תפקיד משתמש</w:t>
+        <w:rPr>
+          <w:b w:val="0"/>
+          <w:sz w:val="22"/>
+        </w:rPr>
+        <w:t>Work Manager (field)</w:t>
       </w:r>
     </w:p>
     <w:p>
       <w:pPr>
+        <w:pStyle w:val="Heading3"/>
+        <w:jc w:val="right"/>
+      </w:pPr>
+      <w:r>
+        <w:t>Description</w:t>
+      </w:r>
+    </w:p>
+    <w:p>
+      <w:pPr>
         <w:jc w:val="right"/>
         <w:bidi/>
       </w:pPr>
       <w:r>
         <w:rPr>
           <w:b w:val="0"/>
-          <w:i w:val="0"/>
           <w:sz w:val="22"/>
         </w:rPr>
-        <w:t>מנהלת חשבונות.</w:t>
+        <w:t>License plate entry validates equipment against the approved work order. Checks: plate exists, correct supplier, WO is approved.</w:t>
       </w:r>
     </w:p>
     <w:p>
-      <w:pPr>
-        <w:pStyle w:val="Heading3"/>
-        <w:jc w:val="right"/>
-      </w:pPr>
       <w:r>
-        <w:t>מטרה</w:t>
+        <w:t>----------------------------------------------------------------------</w:t>
       </w:r>
     </w:p>
     <w:p>
       <w:pPr>
+        <w:pStyle w:val="Heading2"/>
+        <w:jc w:val="right"/>
+      </w:pPr>
+      <w:r>
+        <w:t>8. Project Workspace</w:t>
+      </w:r>
+    </w:p>
+    <w:p>
+      <w:pPr>
+        <w:jc w:val="center"/>
+      </w:pPr>
+      <w:r>
+        <w:drawing>
+          <wp:inline xmlns:a="http://schemas.openxmlformats.org/drawingml/2006/main" xmlns:pic="http://schemas.openxmlformats.org/drawingml/2006/picture">
+            <wp:extent cx="5029200" cy="3143250"/>
+            <wp:docPr id="8" name="Picture 8"/>
+            <wp:cNvGraphicFramePr>
+              <a:graphicFrameLocks noChangeAspect="1"/>
+            </wp:cNvGraphicFramePr>
+            <a:graphic>
+              <a:graphicData uri="http://schemas.openxmlformats.org/drawingml/2006/picture">
+                <pic:pic>
+                  <pic:nvPicPr>
+                    <pic:cNvPr id="0" name="worklog.png"/>
+                    <pic:cNvPicPr/>
+                  </pic:nvPicPr>
+                  <pic:blipFill>
+                    <a:blip r:embed="rId16"/>
+                    <a:stretch>
+                      <a:fillRect/>
+                    </a:stretch>
+                  </pic:blipFill>
+                  <pic:spPr>
+                    <a:xfrm>
+                      <a:off x="0" y="0"/>
+                      <a:ext cx="5029200" cy="3143250"/>
+                    </a:xfrm>
+                    <a:prstGeom prst="rect"/>
+                  </pic:spPr>
+                </pic:pic>
+              </a:graphicData>
+            </a:graphic>
+          </wp:inline>
+        </w:drawing>
+      </w:r>
+    </w:p>
+    <w:p>
+      <w:pPr>
+        <w:pStyle w:val="Heading3"/>
+        <w:jc w:val="right"/>
+      </w:pPr>
+      <w:r>
+        <w:t>Role</w:t>
+      </w:r>
+    </w:p>
+    <w:p>
+      <w:pPr>
         <w:jc w:val="right"/>
         <w:bidi/>
       </w:pPr>
       <w:r>
         <w:rPr>
           <w:b w:val="0"/>
-          <w:i w:val="0"/>
           <w:sz w:val="22"/>
         </w:rPr>
-        <w:t>ניהול מחזור החשבוניות — יצירה מדיווחים מאושרים, אישור, סימון כשולם. מספר חשבונית אוטומטי: INV-YYYY-NNNN.</w:t>
+        <w:t>Work Manager</w:t>
       </w:r>
     </w:p>
     <w:p>
@@ -1466,7 +789,7 @@
         <w:jc w:val="right"/>
       </w:pPr>
       <w:r>
-        <w:t>הערות</w:t>
+        <w:t>Description</w:t>
       </w:r>
     </w:p>
     <w:p>
@@ -1477,10 +800,208 @@
       <w:r>
         <w:rPr>
           <w:b w:val="0"/>
-          <w:i w:val="0"/>
           <w:sz w:val="22"/>
         </w:rPr>
-        <w:t>מעבר סטטוס נאכף: DRAFT → APPROVED → PAID. לא ניתן לדלג על שלבים.</w:t>
+        <w:t>Field workspace: work order status, equipment scans, worklog creation with automatic cost calculation.</w:t>
+      </w:r>
+    </w:p>
+    <w:p>
+      <w:r>
+        <w:t>----------------------------------------------------------------------</w:t>
+      </w:r>
+    </w:p>
+    <w:p>
+      <w:pPr>
+        <w:pStyle w:val="Heading2"/>
+        <w:jc w:val="right"/>
+      </w:pPr>
+      <w:r>
+        <w:t>9. Accounting Approval</w:t>
+      </w:r>
+    </w:p>
+    <w:p>
+      <w:pPr>
+        <w:jc w:val="center"/>
+      </w:pPr>
+      <w:r>
+        <w:drawing>
+          <wp:inline xmlns:a="http://schemas.openxmlformats.org/drawingml/2006/main" xmlns:pic="http://schemas.openxmlformats.org/drawingml/2006/picture">
+            <wp:extent cx="5029200" cy="3143250"/>
+            <wp:docPr id="9" name="Picture 9"/>
+            <wp:cNvGraphicFramePr>
+              <a:graphicFrameLocks noChangeAspect="1"/>
+            </wp:cNvGraphicFramePr>
+            <a:graphic>
+              <a:graphicData uri="http://schemas.openxmlformats.org/drawingml/2006/picture">
+                <pic:pic>
+                  <pic:nvPicPr>
+                    <pic:cNvPr id="0" name="accounting.png"/>
+                    <pic:cNvPicPr/>
+                  </pic:nvPicPr>
+                  <pic:blipFill>
+                    <a:blip r:embed="rId17"/>
+                    <a:stretch>
+                      <a:fillRect/>
+                    </a:stretch>
+                  </pic:blipFill>
+                  <pic:spPr>
+                    <a:xfrm>
+                      <a:off x="0" y="0"/>
+                      <a:ext cx="5029200" cy="3143250"/>
+                    </a:xfrm>
+                    <a:prstGeom prst="rect"/>
+                  </pic:spPr>
+                </pic:pic>
+              </a:graphicData>
+            </a:graphic>
+          </wp:inline>
+        </w:drawing>
+      </w:r>
+    </w:p>
+    <w:p>
+      <w:pPr>
+        <w:pStyle w:val="Heading3"/>
+        <w:jc w:val="right"/>
+      </w:pPr>
+      <w:r>
+        <w:t>Role</w:t>
+      </w:r>
+    </w:p>
+    <w:p>
+      <w:pPr>
+        <w:jc w:val="right"/>
+        <w:bidi/>
+      </w:pPr>
+      <w:r>
+        <w:rPr>
+          <w:b w:val="0"/>
+          <w:sz w:val="22"/>
+        </w:rPr>
+        <w:t>Accountant</w:t>
+      </w:r>
+    </w:p>
+    <w:p>
+      <w:pPr>
+        <w:pStyle w:val="Heading3"/>
+        <w:jc w:val="right"/>
+      </w:pPr>
+      <w:r>
+        <w:t>Description</w:t>
+      </w:r>
+    </w:p>
+    <w:p>
+      <w:pPr>
+        <w:jc w:val="right"/>
+        <w:bidi/>
+      </w:pPr>
+      <w:r>
+        <w:rPr>
+          <w:b w:val="0"/>
+          <w:sz w:val="22"/>
+        </w:rPr>
+        <w:t>Financial inbox: review and approve submitted worklogs. Self-approval blocked. Access limited to own area only.</w:t>
+      </w:r>
+    </w:p>
+    <w:p>
+      <w:r>
+        <w:t>----------------------------------------------------------------------</w:t>
+      </w:r>
+    </w:p>
+    <w:p>
+      <w:pPr>
+        <w:pStyle w:val="Heading2"/>
+        <w:jc w:val="right"/>
+      </w:pPr>
+      <w:r>
+        <w:t>10. Invoices</w:t>
+      </w:r>
+    </w:p>
+    <w:p>
+      <w:pPr>
+        <w:jc w:val="center"/>
+      </w:pPr>
+      <w:r>
+        <w:drawing>
+          <wp:inline xmlns:a="http://schemas.openxmlformats.org/drawingml/2006/main" xmlns:pic="http://schemas.openxmlformats.org/drawingml/2006/picture">
+            <wp:extent cx="5029200" cy="3143250"/>
+            <wp:docPr id="10" name="Picture 10"/>
+            <wp:cNvGraphicFramePr>
+              <a:graphicFrameLocks noChangeAspect="1"/>
+            </wp:cNvGraphicFramePr>
+            <a:graphic>
+              <a:graphicData uri="http://schemas.openxmlformats.org/drawingml/2006/picture">
+                <pic:pic>
+                  <pic:nvPicPr>
+                    <pic:cNvPr id="0" name="invoices.png"/>
+                    <pic:cNvPicPr/>
+                  </pic:nvPicPr>
+                  <pic:blipFill>
+                    <a:blip r:embed="rId18"/>
+                    <a:stretch>
+                      <a:fillRect/>
+                    </a:stretch>
+                  </pic:blipFill>
+                  <pic:spPr>
+                    <a:xfrm>
+                      <a:off x="0" y="0"/>
+                      <a:ext cx="5029200" cy="3143250"/>
+                    </a:xfrm>
+                    <a:prstGeom prst="rect"/>
+                  </pic:spPr>
+                </pic:pic>
+              </a:graphicData>
+            </a:graphic>
+          </wp:inline>
+        </w:drawing>
+      </w:r>
+    </w:p>
+    <w:p>
+      <w:pPr>
+        <w:pStyle w:val="Heading3"/>
+        <w:jc w:val="right"/>
+      </w:pPr>
+      <w:r>
+        <w:t>Role</w:t>
+      </w:r>
+    </w:p>
+    <w:p>
+      <w:pPr>
+        <w:jc w:val="right"/>
+        <w:bidi/>
+      </w:pPr>
+      <w:r>
+        <w:rPr>
+          <w:b w:val="0"/>
+          <w:sz w:val="22"/>
+        </w:rPr>
+        <w:t>Accountant</w:t>
+      </w:r>
+    </w:p>
+    <w:p>
+      <w:pPr>
+        <w:pStyle w:val="Heading3"/>
+        <w:jc w:val="right"/>
+      </w:pPr>
+      <w:r>
+        <w:t>Description</w:t>
+      </w:r>
+    </w:p>
+    <w:p>
+      <w:pPr>
+        <w:jc w:val="right"/>
+        <w:bidi/>
+      </w:pPr>
+      <w:r>
+        <w:rPr>
+          <w:b w:val="0"/>
+          <w:sz w:val="22"/>
+        </w:rPr>
+        <w:t>Invoice lifecycle: create from approved worklogs, auto-number (INV-YYYY-NNNN), approve, mark paid. State machine: DRAFT &gt; APPROVED &gt; PAID.</w:t>
+      </w:r>
+    </w:p>
+    <w:p>
+      <w:r>
+        <w:t>----------------------------------------------------------------------</w:t>
       </w:r>
     </w:p>
     <w:p>
@@ -1497,7 +1018,7 @@
         <w:rPr>
           <w:color w:val="1F6F43"/>
         </w:rPr>
-        <w:t>נספח ב׳ — תהליכים עסקיים מרכזיים</w:t>
+        <w:t>Core Processes</w:t>
       </w:r>
     </w:p>
     <w:p/>
@@ -1507,110 +1028,29 @@
         <w:jc w:val="right"/>
       </w:pPr>
       <w:r>
-        <w:t>תהליך 1: יצירת הזמנת עבודה + שיבוץ ספק</w:t>
+        <w:t>Process 1: Work Order Creation + Supplier Assignment</w:t>
       </w:r>
     </w:p>
     <w:p>
       <w:pPr>
-        <w:pStyle w:val="Heading3"/>
         <w:jc w:val="right"/>
+        <w:bidi/>
       </w:pPr>
       <w:r>
-        <w:t>למה התהליך הזה קריטי</w:t>
+        <w:rPr>
+          <w:b/>
+          <w:sz w:val="22"/>
+        </w:rPr>
+        <w:t>Replaces manual phone/WhatsApp coordination with automated fair rotation. Supplier receives a time-limited portal link. On rejection or expiry, system auto-rotates to next supplier.</w:t>
       </w:r>
     </w:p>
     <w:p>
       <w:pPr>
-        <w:jc w:val="right"/>
-        <w:bidi/>
-      </w:pPr>
-      <w:r>
-        <w:rPr>
-          <w:b w:val="0"/>
-          <w:i w:val="0"/>
-          <w:sz w:val="22"/>
-        </w:rPr>
-        <w:t>בארגון המנהל עשרות פרויקטים עם עשרות ספקים, תיאום ידני (טלפונים, אקסלים) גורם לעיכובים ואי-הוגנות. תהליך זה מחליף את התיאום הידני במנגנון אוטומטי: ספק נבחר בהגינות (סבב הוגן) ומקבל קישור מאובטח לאישור.</w:t>
-      </w:r>
-    </w:p>
-    <w:p>
-      <w:pPr>
         <w:pStyle w:val="Heading3"/>
         <w:jc w:val="right"/>
       </w:pPr>
       <w:r>
-        <w:t>קבצי Frontend</w:t>
-      </w:r>
-    </w:p>
-    <w:p>
-      <w:pPr>
-        <w:pStyle w:val="ListBullet"/>
-        <w:jc w:val="right"/>
-        <w:bidi/>
-      </w:pPr>
-      <w:r>
-        <w:rPr>
-          <w:sz w:val="21"/>
-        </w:rPr>
-        <w:t>app_frontend/src/pages/WorkOrders/NewWorkOrder.tsx — טופס יצירת הזמנה</w:t>
-      </w:r>
-    </w:p>
-    <w:p>
-      <w:pPr>
-        <w:pStyle w:val="Heading3"/>
-        <w:jc w:val="right"/>
-      </w:pPr>
-      <w:r>
-        <w:t>קבצי Backend</w:t>
-      </w:r>
-    </w:p>
-    <w:p>
-      <w:pPr>
-        <w:pStyle w:val="ListBullet"/>
-        <w:jc w:val="right"/>
-        <w:bidi/>
-      </w:pPr>
-      <w:r>
-        <w:rPr>
-          <w:sz w:val="21"/>
-        </w:rPr>
-        <w:t>app_backend/app/services/work_order_service.py — לוגיקה עסקית</w:t>
-      </w:r>
-    </w:p>
-    <w:p>
-      <w:pPr>
-        <w:pStyle w:val="ListBullet"/>
-        <w:jc w:val="right"/>
-        <w:bidi/>
-      </w:pPr>
-      <w:r>
-        <w:rPr>
-          <w:sz w:val="21"/>
-        </w:rPr>
-        <w:t>app_backend/app/routers/work_orders.py — API endpoints</w:t>
-      </w:r>
-    </w:p>
-    <w:p>
-      <w:pPr>
-        <w:pStyle w:val="Heading3"/>
-        <w:jc w:val="right"/>
-      </w:pPr>
-      <w:r>
-        <w:t>קטע קוד — יצירת הזמנה</w:t>
-      </w:r>
-    </w:p>
-    <w:p>
-      <w:pPr>
-        <w:jc w:val="left"/>
-        <w:shd w:val="clear" w:color="auto" w:fill="1E1E2E"/>
-      </w:pPr>
-      <w:r>
-        <w:rPr>
-          <w:rFonts w:ascii="Consolas" w:hAnsi="Consolas"/>
-          <w:color w:val="D4D4D4"/>
-          <w:sz w:val="15"/>
-        </w:rPr>
-        <w:t># app_backend/app/services/work_order_service.py</w:t>
+        <w:t>Backend: app_backend/app/services/work_order_service.py</w:t>
       </w:r>
     </w:p>
     <w:p>
@@ -1638,20 +1078,6 @@
           <w:color w:val="D4D4D4"/>
           <w:sz w:val="15"/>
         </w:rPr>
-        <w:t xml:space="preserve">    # Validate equipment type exists in system categories</w:t>
-      </w:r>
-    </w:p>
-    <w:p>
-      <w:pPr>
-        <w:jc w:val="left"/>
-        <w:shd w:val="clear" w:color="auto" w:fill="1E1E2E"/>
-      </w:pPr>
-      <w:r>
-        <w:rPr>
-          <w:rFonts w:ascii="Consolas" w:hAnsi="Consolas"/>
-          <w:color w:val="D4D4D4"/>
-          <w:sz w:val="15"/>
-        </w:rPr>
         <w:t xml:space="preserve">    cat_row = db.execute(text(</w:t>
       </w:r>
     </w:p>
@@ -1709,20 +1135,6 @@
           <w:sz w:val="15"/>
         </w:rPr>
         <w:t xml:space="preserve">        raise HTTPException(400, "Equipment type not found")</w:t>
-      </w:r>
-    </w:p>
-    <w:p>
-      <w:pPr>
-        <w:jc w:val="left"/>
-        <w:shd w:val="clear" w:color="auto" w:fill="1E1E2E"/>
-      </w:pPr>
-      <w:r>
-        <w:rPr>
-          <w:rFonts w:ascii="Consolas" w:hAnsi="Consolas"/>
-          <w:color w:val="D4D4D4"/>
-          <w:sz w:val="15"/>
-        </w:rPr>
-        <w:t xml:space="preserve"> </w:t>
       </w:r>
     </w:p>
     <w:p>
@@ -1784,29 +1196,6 @@
     <w:p/>
     <w:p>
       <w:pPr>
-        <w:pStyle w:val="Heading3"/>
-        <w:jc w:val="right"/>
-      </w:pPr>
-      <w:r>
-        <w:t>קטע קוד — שליחה לספק (כולל סבב הוגן)</w:t>
-      </w:r>
-    </w:p>
-    <w:p>
-      <w:pPr>
-        <w:jc w:val="left"/>
-        <w:shd w:val="clear" w:color="auto" w:fill="1E1E2E"/>
-      </w:pPr>
-      <w:r>
-        <w:rPr>
-          <w:rFonts w:ascii="Consolas" w:hAnsi="Consolas"/>
-          <w:color w:val="D4D4D4"/>
-          <w:sz w:val="15"/>
-        </w:rPr>
-        <w:t># app_backend/app/services/work_order_service.py</w:t>
-      </w:r>
-    </w:p>
-    <w:p>
-      <w:pPr>
         <w:jc w:val="left"/>
         <w:shd w:val="clear" w:color="auto" w:fill="1E1E2E"/>
       </w:pPr>
@@ -1830,20 +1219,6 @@
           <w:color w:val="D4D4D4"/>
           <w:sz w:val="15"/>
         </w:rPr>
-        <w:t xml:space="preserve">    # If no supplier — use Fair Rotation algorithm</w:t>
-      </w:r>
-    </w:p>
-    <w:p>
-      <w:pPr>
-        <w:jc w:val="left"/>
-        <w:shd w:val="clear" w:color="auto" w:fill="1E1E2E"/>
-      </w:pPr>
-      <w:r>
-        <w:rPr>
-          <w:rFonts w:ascii="Consolas" w:hAnsi="Consolas"/>
-          <w:color w:val="D4D4D4"/>
-          <w:sz w:val="15"/>
-        </w:rPr>
         <w:t xml:space="preserve">    if not work_order.supplier_id:</w:t>
       </w:r>
     </w:p>
@@ -1886,34 +1261,6 @@
           <w:color w:val="D4D4D4"/>
           <w:sz w:val="15"/>
         </w:rPr>
-        <w:t xml:space="preserve"> </w:t>
-      </w:r>
-    </w:p>
-    <w:p>
-      <w:pPr>
-        <w:jc w:val="left"/>
-        <w:shd w:val="clear" w:color="auto" w:fill="1E1E2E"/>
-      </w:pPr>
-      <w:r>
-        <w:rPr>
-          <w:rFonts w:ascii="Consolas" w:hAnsi="Consolas"/>
-          <w:color w:val="D4D4D4"/>
-          <w:sz w:val="15"/>
-        </w:rPr>
-        <w:t xml:space="preserve">    # Token valid for 3 hours only</w:t>
-      </w:r>
-    </w:p>
-    <w:p>
-      <w:pPr>
-        <w:jc w:val="left"/>
-        <w:shd w:val="clear" w:color="auto" w:fill="1E1E2E"/>
-      </w:pPr>
-      <w:r>
-        <w:rPr>
-          <w:rFonts w:ascii="Consolas" w:hAnsi="Consolas"/>
-          <w:color w:val="D4D4D4"/>
-          <w:sz w:val="15"/>
-        </w:rPr>
         <w:t xml:space="preserve">    work_order.portal_token = secrets.token_urlsafe(32)</w:t>
       </w:r>
     </w:p>
@@ -1960,15 +1307,6 @@
       </w:r>
     </w:p>
     <w:p/>
-    <w:p>
-      <w:pPr>
-        <w:pStyle w:val="Heading3"/>
-        <w:jc w:val="right"/>
-      </w:pPr>
-      <w:r>
-        <w:t>זרימה</w:t>
-      </w:r>
-    </w:p>
     <w:tbl>
       <w:tblPr>
         <w:tblStyle w:val="TableGrid"/>
@@ -1994,7 +1332,7 @@
                 <w:b/>
                 <w:sz w:val="17"/>
               </w:rPr>
-              <w:t>שלב</w:t>
+              <w:t>Step</w:t>
             </w:r>
           </w:p>
         </w:tc>
@@ -2009,7 +1347,7 @@
                 <w:b/>
                 <w:sz w:val="17"/>
               </w:rPr>
-              <w:t>קלט</w:t>
+              <w:t>Input</w:t>
             </w:r>
           </w:p>
         </w:tc>
@@ -2024,7 +1362,7 @@
                 <w:b/>
                 <w:sz w:val="17"/>
               </w:rPr>
-              <w:t>עיבוד</w:t>
+              <w:t>Processing</w:t>
             </w:r>
           </w:p>
         </w:tc>
@@ -2039,7 +1377,7 @@
                 <w:b/>
                 <w:sz w:val="17"/>
               </w:rPr>
-              <w:t>פלט</w:t>
+              <w:t>Output</w:t>
             </w:r>
           </w:p>
         </w:tc>
@@ -2069,7 +1407,7 @@
                 <w:rFonts w:ascii="Consolas" w:hAnsi="Consolas"/>
                 <w:sz w:val="16"/>
               </w:rPr>
-              <w:t>פרטי הזמנה</w:t>
+              <w:t>Order details</w:t>
             </w:r>
           </w:p>
         </w:tc>
@@ -2083,7 +1421,7 @@
                 <w:rFonts w:ascii="Consolas" w:hAnsi="Consolas"/>
                 <w:sz w:val="16"/>
               </w:rPr>
-              <w:t>ולידציה, בדיקת תקציב</w:t>
+              <w:t>Validation + budget check</w:t>
             </w:r>
           </w:p>
         </w:tc>
@@ -2127,7 +1465,7 @@
                 <w:rFonts w:ascii="Consolas" w:hAnsi="Consolas"/>
                 <w:sz w:val="16"/>
               </w:rPr>
-              <w:t>הקצאה</w:t>
+              <w:t>Allocation method</w:t>
             </w:r>
           </w:p>
         </w:tc>
@@ -2141,7 +1479,7 @@
                 <w:rFonts w:ascii="Consolas" w:hAnsi="Consolas"/>
                 <w:sz w:val="16"/>
               </w:rPr>
-              <w:t>בחירת ספק (סבב הוגן/ידני)</w:t>
+              <w:t>Fair Rotation / forced</w:t>
             </w:r>
           </w:p>
         </w:tc>
@@ -2185,7 +1523,7 @@
                 <w:rFonts w:ascii="Consolas" w:hAnsi="Consolas"/>
                 <w:sz w:val="16"/>
               </w:rPr>
-              <w:t>תגובת ספק</w:t>
+              <w:t>Supplier response</w:t>
             </w:r>
           </w:p>
         </w:tc>
@@ -2199,7 +1537,7 @@
                 <w:rFonts w:ascii="Consolas" w:hAnsi="Consolas"/>
                 <w:sz w:val="16"/>
               </w:rPr>
-              <w:t>עדכון סטטוס + ציוד</w:t>
+              <w:t>Status update + equipment</w:t>
             </w:r>
           </w:p>
         </w:tc>
@@ -2243,7 +1581,7 @@
                 <w:rFonts w:ascii="Consolas" w:hAnsi="Consolas"/>
                 <w:sz w:val="16"/>
               </w:rPr>
-              <w:t>אישור מתאם</w:t>
+              <w:t>Coordinator approval</w:t>
             </w:r>
           </w:p>
         </w:tc>
@@ -2257,7 +1595,7 @@
                 <w:rFonts w:ascii="Consolas" w:hAnsi="Consolas"/>
                 <w:sz w:val="16"/>
               </w:rPr>
-              <w:t>אישור סופי</w:t>
+              <w:t>Final approval</w:t>
             </w:r>
           </w:p>
         </w:tc>
@@ -2278,15 +1616,6 @@
       </w:tr>
     </w:tbl>
     <w:p/>
-    <w:p>
-      <w:pPr>
-        <w:pStyle w:val="Heading3"/>
-        <w:jc w:val="right"/>
-      </w:pPr>
-      <w:r>
-        <w:t>מסד נתונים — work_orders (שדות מרכזיים)</w:t>
-      </w:r>
-    </w:p>
     <w:tbl>
       <w:tblPr>
         <w:tblStyle w:val="TableGrid"/>
@@ -2312,7 +1641,7 @@
                 <w:b/>
                 <w:sz w:val="17"/>
               </w:rPr>
-              <w:t>שדה</w:t>
+              <w:t>Field</w:t>
             </w:r>
           </w:p>
         </w:tc>
@@ -2327,7 +1656,7 @@
                 <w:b/>
                 <w:sz w:val="17"/>
               </w:rPr>
-              <w:t>סוג</w:t>
+              <w:t>Type</w:t>
             </w:r>
           </w:p>
         </w:tc>
@@ -2342,7 +1671,7 @@
                 <w:b/>
                 <w:sz w:val="17"/>
               </w:rPr>
-              <w:t>תיאור</w:t>
+              <w:t>Description</w:t>
             </w:r>
           </w:p>
         </w:tc>
@@ -2357,64 +1686,7 @@
                 <w:b/>
                 <w:sz w:val="17"/>
               </w:rPr>
-              <w:t>קשר</w:t>
-            </w:r>
-          </w:p>
-        </w:tc>
-      </w:tr>
-      <w:tr>
-        <w:tc>
-          <w:tcPr>
-            <w:tcW w:type="dxa" w:w="2351"/>
-          </w:tcPr>
-          <w:p>
-            <w:r>
-              <w:rPr>
-                <w:rFonts w:ascii="Consolas" w:hAnsi="Consolas"/>
-                <w:sz w:val="16"/>
-              </w:rPr>
-              <w:t>id</w:t>
-            </w:r>
-          </w:p>
-        </w:tc>
-        <w:tc>
-          <w:tcPr>
-            <w:tcW w:type="dxa" w:w="2351"/>
-          </w:tcPr>
-          <w:p>
-            <w:r>
-              <w:rPr>
-                <w:rFonts w:ascii="Consolas" w:hAnsi="Consolas"/>
-                <w:sz w:val="16"/>
-              </w:rPr>
-              <w:t>integer PK</w:t>
-            </w:r>
-          </w:p>
-        </w:tc>
-        <w:tc>
-          <w:tcPr>
-            <w:tcW w:type="dxa" w:w="2351"/>
-          </w:tcPr>
-          <w:p>
-            <w:r>
-              <w:rPr>
-                <w:rFonts w:ascii="Consolas" w:hAnsi="Consolas"/>
-                <w:sz w:val="16"/>
-              </w:rPr>
-              <w:t>מזהה</w:t>
-            </w:r>
-          </w:p>
-        </w:tc>
-        <w:tc>
-          <w:tcPr>
-            <w:tcW w:type="dxa" w:w="2351"/>
-          </w:tcPr>
-          <w:p>
-            <w:r>
-              <w:rPr>
-                <w:rFonts w:ascii="Consolas" w:hAnsi="Consolas"/>
-                <w:sz w:val="16"/>
-              </w:rPr>
+              <w:t>FK</w:t>
             </w:r>
           </w:p>
         </w:tc>
@@ -2458,7 +1730,7 @@
                 <w:rFonts w:ascii="Consolas" w:hAnsi="Consolas"/>
                 <w:sz w:val="16"/>
               </w:rPr>
-              <w:t>פרויקט</w:t>
+              <w:t>Project</w:t>
             </w:r>
           </w:p>
         </w:tc>
@@ -2472,7 +1744,7 @@
                 <w:rFonts w:ascii="Consolas" w:hAnsi="Consolas"/>
                 <w:sz w:val="16"/>
               </w:rPr>
-              <w:t>→ projects.id</w:t>
+              <w:t>projects.id</w:t>
             </w:r>
           </w:p>
         </w:tc>
@@ -2516,7 +1788,7 @@
                 <w:rFonts w:ascii="Consolas" w:hAnsi="Consolas"/>
                 <w:sz w:val="16"/>
               </w:rPr>
-              <w:t>ספק</w:t>
+              <w:t>Selected supplier</w:t>
             </w:r>
           </w:p>
         </w:tc>
@@ -2530,7 +1802,7 @@
                 <w:rFonts w:ascii="Consolas" w:hAnsi="Consolas"/>
                 <w:sz w:val="16"/>
               </w:rPr>
-              <w:t>→ suppliers.id</w:t>
+              <w:t>suppliers.id</w:t>
             </w:r>
           </w:p>
         </w:tc>
@@ -2574,7 +1846,7 @@
                 <w:rFonts w:ascii="Consolas" w:hAnsi="Consolas"/>
                 <w:sz w:val="16"/>
               </w:rPr>
-              <w:t>מכונת מצבים</w:t>
+              <w:t>State machine</w:t>
             </w:r>
           </w:p>
         </w:tc>
@@ -2631,64 +1903,7 @@
                 <w:rFonts w:ascii="Consolas" w:hAnsi="Consolas"/>
                 <w:sz w:val="16"/>
               </w:rPr>
-              <w:t>token גישה לספק</w:t>
-            </w:r>
-          </w:p>
-        </w:tc>
-        <w:tc>
-          <w:tcPr>
-            <w:tcW w:type="dxa" w:w="2351"/>
-          </w:tcPr>
-          <w:p>
-            <w:r>
-              <w:rPr>
-                <w:rFonts w:ascii="Consolas" w:hAnsi="Consolas"/>
-                <w:sz w:val="16"/>
-              </w:rPr>
-            </w:r>
-          </w:p>
-        </w:tc>
-      </w:tr>
-      <w:tr>
-        <w:tc>
-          <w:tcPr>
-            <w:tcW w:type="dxa" w:w="2351"/>
-          </w:tcPr>
-          <w:p>
-            <w:r>
-              <w:rPr>
-                <w:rFonts w:ascii="Consolas" w:hAnsi="Consolas"/>
-                <w:sz w:val="16"/>
-              </w:rPr>
-              <w:t>portal_expiry</w:t>
-            </w:r>
-          </w:p>
-        </w:tc>
-        <w:tc>
-          <w:tcPr>
-            <w:tcW w:type="dxa" w:w="2351"/>
-          </w:tcPr>
-          <w:p>
-            <w:r>
-              <w:rPr>
-                <w:rFonts w:ascii="Consolas" w:hAnsi="Consolas"/>
-                <w:sz w:val="16"/>
-              </w:rPr>
-              <w:t>timestamp</w:t>
-            </w:r>
-          </w:p>
-        </w:tc>
-        <w:tc>
-          <w:tcPr>
-            <w:tcW w:type="dxa" w:w="2351"/>
-          </w:tcPr>
-          <w:p>
-            <w:r>
-              <w:rPr>
-                <w:rFonts w:ascii="Consolas" w:hAnsi="Consolas"/>
-                <w:sz w:val="16"/>
-              </w:rPr>
-              <w:t>תוקף token</w:t>
+              <w:t>Supplier access token</w:t>
             </w:r>
           </w:p>
         </w:tc>
@@ -2763,63 +1978,6 @@
           </w:p>
         </w:tc>
       </w:tr>
-      <w:tr>
-        <w:tc>
-          <w:tcPr>
-            <w:tcW w:type="dxa" w:w="2351"/>
-          </w:tcPr>
-          <w:p>
-            <w:r>
-              <w:rPr>
-                <w:rFonts w:ascii="Consolas" w:hAnsi="Consolas"/>
-                <w:sz w:val="16"/>
-              </w:rPr>
-              <w:t>frozen_amount</w:t>
-            </w:r>
-          </w:p>
-        </w:tc>
-        <w:tc>
-          <w:tcPr>
-            <w:tcW w:type="dxa" w:w="2351"/>
-          </w:tcPr>
-          <w:p>
-            <w:r>
-              <w:rPr>
-                <w:rFonts w:ascii="Consolas" w:hAnsi="Consolas"/>
-                <w:sz w:val="16"/>
-              </w:rPr>
-              <w:t>numeric</w:t>
-            </w:r>
-          </w:p>
-        </w:tc>
-        <w:tc>
-          <w:tcPr>
-            <w:tcW w:type="dxa" w:w="2351"/>
-          </w:tcPr>
-          <w:p>
-            <w:r>
-              <w:rPr>
-                <w:rFonts w:ascii="Consolas" w:hAnsi="Consolas"/>
-                <w:sz w:val="16"/>
-              </w:rPr>
-              <w:t>מוקפא מתקציב</w:t>
-            </w:r>
-          </w:p>
-        </w:tc>
-        <w:tc>
-          <w:tcPr>
-            <w:tcW w:type="dxa" w:w="2351"/>
-          </w:tcPr>
-          <w:p>
-            <w:r>
-              <w:rPr>
-                <w:rFonts w:ascii="Consolas" w:hAnsi="Consolas"/>
-                <w:sz w:val="16"/>
-              </w:rPr>
-            </w:r>
-          </w:p>
-        </w:tc>
-      </w:tr>
     </w:tbl>
     <w:p/>
     <w:p>
@@ -2842,7 +2000,7 @@
                     <pic:cNvPicPr/>
                   </pic:nvPicPr>
                   <pic:blipFill>
-                    <a:blip r:embed="rId12"/>
+                    <a:blip r:embed="rId19"/>
                     <a:stretch>
                       <a:fillRect/>
                     </a:stretch>
@@ -2870,30 +2028,20 @@
           <w:i/>
           <w:sz w:val="18"/>
         </w:rPr>
-        <w:t>DB: טבלת work_orders לאחר יצירת הזמנות</w:t>
+        <w:t>DB: work_orders table after creation</w:t>
       </w:r>
     </w:p>
     <w:p>
       <w:pPr>
-        <w:pStyle w:val="Heading3"/>
-        <w:jc w:val="right"/>
-      </w:pPr>
-      <w:r>
-        <w:t>סיכום תהליך</w:t>
-      </w:r>
-    </w:p>
-    <w:p>
-      <w:pPr>
         <w:jc w:val="right"/>
         <w:bidi/>
       </w:pPr>
       <w:r>
         <w:rPr>
-          <w:b w:val="0"/>
-          <w:i w:val="0"/>
+          <w:b/>
           <w:sz w:val="22"/>
         </w:rPr>
-        <w:t>תהליך זה מבטיח שכל הזמנת עבודה עוברת מסלול מוגדר ושקוף — מיצירה, דרך בחירת ספק אוטומטית בסבב הוגן, ועד לאישור סופי. מנגנון ה-token המוגבל בזמן מבטיח תגובה מהירה מהספק ומונע הזמנות תלויות ללא מענה.</w:t>
+        <w:t>This process ensures every work order follows a transparent path from creation through fair supplier selection to final approval. The time-limited token mechanism prevents forgotten orders.</w:t>
       </w:r>
     </w:p>
     <w:p>
@@ -2907,97 +2055,29 @@
         <w:jc w:val="right"/>
       </w:pPr>
       <w:r>
-        <w:t>תהליך 2: אימות כלי לפי מספר רישוי</w:t>
+        <w:t>Process 2: Equipment Validation by License Plate</w:t>
       </w:r>
     </w:p>
     <w:p>
       <w:pPr>
-        <w:pStyle w:val="Heading3"/>
         <w:jc w:val="right"/>
+        <w:bidi/>
       </w:pPr>
       <w:r>
-        <w:t>למה התהליך הזה קריטי</w:t>
+        <w:rPr>
+          <w:b/>
+          <w:sz w:val="22"/>
+        </w:rPr>
+        <w:t>Prevents equipment fraud in the field. Validates that the arriving equipment matches the approved work order: correct supplier, correct type, WO is in APPROVED status.</w:t>
       </w:r>
     </w:p>
     <w:p>
       <w:pPr>
-        <w:jc w:val="right"/>
-        <w:bidi/>
-      </w:pPr>
-      <w:r>
-        <w:rPr>
-          <w:b w:val="0"/>
-          <w:i w:val="0"/>
-          <w:sz w:val="22"/>
-        </w:rPr>
-        <w:t>בשטח, ספק עלול לשלוח כלי שונה מהמאושר. ללא אימות, הארגון משלם עבור ציוד שלא תואם להזמנה. המנגנון מונע הפסדים כספיים ומבטיח שמה שמגיע לשטח הוא בדיוק מה שאושר.</w:t>
-      </w:r>
-    </w:p>
-    <w:p>
-      <w:pPr>
         <w:pStyle w:val="Heading3"/>
         <w:jc w:val="right"/>
       </w:pPr>
       <w:r>
-        <w:t>קבצי Frontend</w:t>
-      </w:r>
-    </w:p>
-    <w:p>
-      <w:pPr>
-        <w:pStyle w:val="ListBullet"/>
-        <w:jc w:val="right"/>
-        <w:bidi/>
-      </w:pPr>
-      <w:r>
-        <w:rPr>
-          <w:sz w:val="21"/>
-        </w:rPr>
-        <w:t>app_frontend/src/pages/Equipment/EquipmentScan.tsx — מסך אימות כלי</w:t>
-      </w:r>
-    </w:p>
-    <w:p>
-      <w:pPr>
-        <w:pStyle w:val="Heading3"/>
-        <w:jc w:val="right"/>
-      </w:pPr>
-      <w:r>
-        <w:t>קבצי Backend</w:t>
-      </w:r>
-    </w:p>
-    <w:p>
-      <w:pPr>
-        <w:pStyle w:val="ListBullet"/>
-        <w:jc w:val="right"/>
-        <w:bidi/>
-      </w:pPr>
-      <w:r>
-        <w:rPr>
-          <w:sz w:val="21"/>
-        </w:rPr>
-        <w:t>app_backend/app/routers/equipment.py — endpoint: POST /validate-plate</w:t>
-      </w:r>
-    </w:p>
-    <w:p>
-      <w:pPr>
-        <w:pStyle w:val="Heading3"/>
-        <w:jc w:val="right"/>
-      </w:pPr>
-      <w:r>
-        <w:t>קטע קוד — Backend: אימות מספר רישוי</w:t>
-      </w:r>
-    </w:p>
-    <w:p>
-      <w:pPr>
-        <w:jc w:val="left"/>
-        <w:shd w:val="clear" w:color="auto" w:fill="1E1E2E"/>
-      </w:pPr>
-      <w:r>
-        <w:rPr>
-          <w:rFonts w:ascii="Consolas" w:hAnsi="Consolas"/>
-          <w:color w:val="D4D4D4"/>
-          <w:sz w:val="15"/>
-        </w:rPr>
-        <w:t># app_backend/app/routers/equipment.py</w:t>
+        <w:t>Backend: app_backend/app/routers/equipment.py</w:t>
       </w:r>
     </w:p>
     <w:p>
@@ -3053,7 +2133,7 @@
           <w:color w:val="D4D4D4"/>
           <w:sz w:val="15"/>
         </w:rPr>
-        <w:t xml:space="preserve">    wo_id = body.get("work_order_id")</w:t>
+        <w:t xml:space="preserve">    eq = db.query(Equipment).filter(</w:t>
       </w:r>
     </w:p>
     <w:p>
@@ -3067,35 +2147,7 @@
           <w:color w:val="D4D4D4"/>
           <w:sz w:val="15"/>
         </w:rPr>
-        <w:t xml:space="preserve"> </w:t>
-      </w:r>
-    </w:p>
-    <w:p>
-      <w:pPr>
-        <w:jc w:val="left"/>
-        <w:shd w:val="clear" w:color="auto" w:fill="1E1E2E"/>
-      </w:pPr>
-      <w:r>
-        <w:rPr>
-          <w:rFonts w:ascii="Consolas" w:hAnsi="Consolas"/>
-          <w:color w:val="D4D4D4"/>
-          <w:sz w:val="15"/>
-        </w:rPr>
-        <w:t xml:space="preserve">    # Search equipment, fallback to supplier_equipment</w:t>
-      </w:r>
-    </w:p>
-    <w:p>
-      <w:pPr>
-        <w:jc w:val="left"/>
-        <w:shd w:val="clear" w:color="auto" w:fill="1E1E2E"/>
-      </w:pPr>
-      <w:r>
-        <w:rPr>
-          <w:rFonts w:ascii="Consolas" w:hAnsi="Consolas"/>
-          <w:color w:val="D4D4D4"/>
-          <w:sz w:val="15"/>
-        </w:rPr>
-        <w:t xml:space="preserve">    eq = db.query(Equipment).filter(Equipment.license_plate == plate).first()</w:t>
+        <w:t xml:space="preserve">        Equipment.license_plate == plate, Equipment.is_active == True).first()</w:t>
       </w:r>
     </w:p>
     <w:p>
@@ -3179,20 +2231,6 @@
           <w:color w:val="D4D4D4"/>
           <w:sz w:val="15"/>
         </w:rPr>
-        <w:t xml:space="preserve"> </w:t>
-      </w:r>
-    </w:p>
-    <w:p>
-      <w:pPr>
-        <w:jc w:val="left"/>
-        <w:shd w:val="clear" w:color="auto" w:fill="1E1E2E"/>
-      </w:pPr>
-      <w:r>
-        <w:rPr>
-          <w:rFonts w:ascii="Consolas" w:hAnsi="Consolas"/>
-          <w:color w:val="D4D4D4"/>
-          <w:sz w:val="15"/>
-        </w:rPr>
         <w:t xml:space="preserve">    if wo_id:</w:t>
       </w:r>
     </w:p>
@@ -3221,7 +2259,7 @@
           <w:color w:val="D4D4D4"/>
           <w:sz w:val="15"/>
         </w:rPr>
-        <w:t xml:space="preserve">        if wo.status != "APPROVED_AND_SENT":      # Rule 1: WO approved</w:t>
+        <w:t xml:space="preserve">        if wo.status != "APPROVED_AND_SENT":</w:t>
       </w:r>
     </w:p>
     <w:p>
@@ -3249,7 +2287,7 @@
           <w:color w:val="D4D4D4"/>
           <w:sz w:val="15"/>
         </w:rPr>
-        <w:t xml:space="preserve">        if supplier_id != wo.supplier_id:          # Rule 2: Correct supplier</w:t>
+        <w:t xml:space="preserve">        if supplier_id != wo.supplier_id:</w:t>
       </w:r>
     </w:p>
     <w:p>
@@ -3291,21 +2329,7 @@
           <w:color w:val="D4D4D4"/>
           <w:sz w:val="15"/>
         </w:rPr>
-        <w:t xml:space="preserve"> </w:t>
-      </w:r>
-    </w:p>
-    <w:p>
-      <w:pPr>
-        <w:jc w:val="left"/>
-        <w:shd w:val="clear" w:color="auto" w:fill="1E1E2E"/>
-      </w:pPr>
-      <w:r>
-        <w:rPr>
-          <w:rFonts w:ascii="Consolas" w:hAnsi="Consolas"/>
-          <w:color w:val="D4D4D4"/>
-          <w:sz w:val="15"/>
-        </w:rPr>
-        <w:t xml:space="preserve">    return result  # { valid, equipment_name, supplier_name, warnings }</w:t>
+        <w:t xml:space="preserve">    return result</w:t>
       </w:r>
     </w:p>
     <w:p/>
@@ -3315,21 +2339,7 @@
         <w:jc w:val="right"/>
       </w:pPr>
       <w:r>
-        <w:t>קטע קוד — Frontend: הזנת מספר רישוי</w:t>
-      </w:r>
-    </w:p>
-    <w:p>
-      <w:pPr>
-        <w:jc w:val="left"/>
-        <w:shd w:val="clear" w:color="auto" w:fill="1E1E2E"/>
-      </w:pPr>
-      <w:r>
-        <w:rPr>
-          <w:rFonts w:ascii="Consolas" w:hAnsi="Consolas"/>
-          <w:color w:val="D4D4D4"/>
-          <w:sz w:val="15"/>
-        </w:rPr>
-        <w:t>// app_frontend/src/pages/Equipment/EquipmentScan.tsx</w:t>
+        <w:t>Frontend: app_frontend/src/pages/Equipment/EquipmentScan.tsx</w:t>
       </w:r>
     </w:p>
     <w:p>
@@ -3445,15 +2455,6 @@
       </w:r>
     </w:p>
     <w:p/>
-    <w:p>
-      <w:pPr>
-        <w:pStyle w:val="Heading3"/>
-        <w:jc w:val="right"/>
-      </w:pPr>
-      <w:r>
-        <w:t>זרימה</w:t>
-      </w:r>
-    </w:p>
     <w:tbl>
       <w:tblPr>
         <w:tblStyle w:val="TableGrid"/>
@@ -3479,7 +2480,7 @@
                 <w:b/>
                 <w:sz w:val="17"/>
               </w:rPr>
-              <w:t>שלב</w:t>
+              <w:t>Field</w:t>
             </w:r>
           </w:p>
         </w:tc>
@@ -3494,7 +2495,7 @@
                 <w:b/>
                 <w:sz w:val="17"/>
               </w:rPr>
-              <w:t>קלט</w:t>
+              <w:t>Type</w:t>
             </w:r>
           </w:p>
         </w:tc>
@@ -3509,7 +2510,7 @@
                 <w:b/>
                 <w:sz w:val="17"/>
               </w:rPr>
-              <w:t>עיבוד</w:t>
+              <w:t>Description</w:t>
             </w:r>
           </w:p>
         </w:tc>
@@ -3524,267 +2525,7 @@
                 <w:b/>
                 <w:sz w:val="17"/>
               </w:rPr>
-              <w:t>פלט</w:t>
-            </w:r>
-          </w:p>
-        </w:tc>
-      </w:tr>
-      <w:tr>
-        <w:tc>
-          <w:tcPr>
-            <w:tcW w:type="dxa" w:w="2351"/>
-          </w:tcPr>
-          <w:p>
-            <w:r>
-              <w:rPr>
-                <w:rFonts w:ascii="Consolas" w:hAnsi="Consolas"/>
-                <w:sz w:val="16"/>
-              </w:rPr>
-              <w:t>1</w:t>
-            </w:r>
-          </w:p>
-        </w:tc>
-        <w:tc>
-          <w:tcPr>
-            <w:tcW w:type="dxa" w:w="2351"/>
-          </w:tcPr>
-          <w:p>
-            <w:r>
-              <w:rPr>
-                <w:rFonts w:ascii="Consolas" w:hAnsi="Consolas"/>
-                <w:sz w:val="16"/>
-              </w:rPr>
-              <w:t>מספר רישוי</w:t>
-            </w:r>
-          </w:p>
-        </w:tc>
-        <w:tc>
-          <w:tcPr>
-            <w:tcW w:type="dxa" w:w="2351"/>
-          </w:tcPr>
-          <w:p>
-            <w:r>
-              <w:rPr>
-                <w:rFonts w:ascii="Consolas" w:hAnsi="Consolas"/>
-                <w:sz w:val="16"/>
-              </w:rPr>
-              <w:t>חיפוש ב-equipment + supplier_equipment</w:t>
-            </w:r>
-          </w:p>
-        </w:tc>
-        <w:tc>
-          <w:tcPr>
-            <w:tcW w:type="dxa" w:w="2351"/>
-          </w:tcPr>
-          <w:p>
-            <w:r>
-              <w:rPr>
-                <w:rFonts w:ascii="Consolas" w:hAnsi="Consolas"/>
-                <w:sz w:val="16"/>
-              </w:rPr>
-              <w:t>כלי נמצא / לא נמצא</w:t>
-            </w:r>
-          </w:p>
-        </w:tc>
-      </w:tr>
-      <w:tr>
-        <w:tc>
-          <w:tcPr>
-            <w:tcW w:type="dxa" w:w="2351"/>
-          </w:tcPr>
-          <w:p>
-            <w:r>
-              <w:rPr>
-                <w:rFonts w:ascii="Consolas" w:hAnsi="Consolas"/>
-                <w:sz w:val="16"/>
-              </w:rPr>
-              <w:t>2</w:t>
-            </w:r>
-          </w:p>
-        </w:tc>
-        <w:tc>
-          <w:tcPr>
-            <w:tcW w:type="dxa" w:w="2351"/>
-          </w:tcPr>
-          <w:p>
-            <w:r>
-              <w:rPr>
-                <w:rFonts w:ascii="Consolas" w:hAnsi="Consolas"/>
-                <w:sz w:val="16"/>
-              </w:rPr>
-              <w:t>כלי + הזמנה</w:t>
-            </w:r>
-          </w:p>
-        </w:tc>
-        <w:tc>
-          <w:tcPr>
-            <w:tcW w:type="dxa" w:w="2351"/>
-          </w:tcPr>
-          <w:p>
-            <w:r>
-              <w:rPr>
-                <w:rFonts w:ascii="Consolas" w:hAnsi="Consolas"/>
-                <w:sz w:val="16"/>
-              </w:rPr>
-              <w:t>בדיקת סטטוס + התאמת ספק</w:t>
-            </w:r>
-          </w:p>
-        </w:tc>
-        <w:tc>
-          <w:tcPr>
-            <w:tcW w:type="dxa" w:w="2351"/>
-          </w:tcPr>
-          <w:p>
-            <w:r>
-              <w:rPr>
-                <w:rFonts w:ascii="Consolas" w:hAnsi="Consolas"/>
-                <w:sz w:val="16"/>
-              </w:rPr>
-              <w:t>valid: true/false + warnings</w:t>
-            </w:r>
-          </w:p>
-        </w:tc>
-      </w:tr>
-      <w:tr>
-        <w:tc>
-          <w:tcPr>
-            <w:tcW w:type="dxa" w:w="2351"/>
-          </w:tcPr>
-          <w:p>
-            <w:r>
-              <w:rPr>
-                <w:rFonts w:ascii="Consolas" w:hAnsi="Consolas"/>
-                <w:sz w:val="16"/>
-              </w:rPr>
-              <w:t>3</w:t>
-            </w:r>
-          </w:p>
-        </w:tc>
-        <w:tc>
-          <w:tcPr>
-            <w:tcW w:type="dxa" w:w="2351"/>
-          </w:tcPr>
-          <w:p>
-            <w:r>
-              <w:rPr>
-                <w:rFonts w:ascii="Consolas" w:hAnsi="Consolas"/>
-                <w:sz w:val="16"/>
-              </w:rPr>
-              <w:t>אימות מוצלח</w:t>
-            </w:r>
-          </w:p>
-        </w:tc>
-        <w:tc>
-          <w:tcPr>
-            <w:tcW w:type="dxa" w:w="2351"/>
-          </w:tcPr>
-          <w:p>
-            <w:r>
-              <w:rPr>
-                <w:rFonts w:ascii="Consolas" w:hAnsi="Consolas"/>
-                <w:sz w:val="16"/>
-              </w:rPr>
-              <w:t>רישום ב-equipment_scans</w:t>
-            </w:r>
-          </w:p>
-        </w:tc>
-        <w:tc>
-          <w:tcPr>
-            <w:tcW w:type="dxa" w:w="2351"/>
-          </w:tcPr>
-          <w:p>
-            <w:r>
-              <w:rPr>
-                <w:rFonts w:ascii="Consolas" w:hAnsi="Consolas"/>
-                <w:sz w:val="16"/>
-              </w:rPr>
-              <w:t>מעבר לדיווח שעות</w:t>
-            </w:r>
-          </w:p>
-        </w:tc>
-      </w:tr>
-    </w:tbl>
-    <w:p/>
-    <w:p>
-      <w:pPr>
-        <w:pStyle w:val="Heading3"/>
-        <w:jc w:val="right"/>
-      </w:pPr>
-      <w:r>
-        <w:t>מסד נתונים — equipment + equipment_scans</w:t>
-      </w:r>
-    </w:p>
-    <w:tbl>
-      <w:tblPr>
-        <w:tblStyle w:val="TableGrid"/>
-        <w:tblW w:type="auto" w:w="0"/>
-        <w:jc w:val="center"/>
-        <w:tblLook w:firstColumn="1" w:firstRow="1" w:lastColumn="0" w:lastRow="0" w:noHBand="0" w:noVBand="1" w:val="04A0"/>
-      </w:tblPr>
-      <w:tblGrid>
-        <w:gridCol w:w="2351"/>
-        <w:gridCol w:w="2351"/>
-        <w:gridCol w:w="2351"/>
-        <w:gridCol w:w="2351"/>
-      </w:tblGrid>
-      <w:tr>
-        <w:tc>
-          <w:tcPr>
-            <w:tcW w:type="dxa" w:w="2351"/>
-          </w:tcPr>
-          <w:p>
-            <w:r>
-              <w:rPr>
-                <w:rFonts w:ascii="Consolas" w:hAnsi="Consolas"/>
-                <w:b/>
-                <w:sz w:val="17"/>
-              </w:rPr>
-              <w:t>טבלה.שדה</w:t>
-            </w:r>
-          </w:p>
-        </w:tc>
-        <w:tc>
-          <w:tcPr>
-            <w:tcW w:type="dxa" w:w="2351"/>
-          </w:tcPr>
-          <w:p>
-            <w:r>
-              <w:rPr>
-                <w:rFonts w:ascii="Consolas" w:hAnsi="Consolas"/>
-                <w:b/>
-                <w:sz w:val="17"/>
-              </w:rPr>
-              <w:t>סוג</w:t>
-            </w:r>
-          </w:p>
-        </w:tc>
-        <w:tc>
-          <w:tcPr>
-            <w:tcW w:type="dxa" w:w="2351"/>
-          </w:tcPr>
-          <w:p>
-            <w:r>
-              <w:rPr>
-                <w:rFonts w:ascii="Consolas" w:hAnsi="Consolas"/>
-                <w:b/>
-                <w:sz w:val="17"/>
-              </w:rPr>
-              <w:t>תיאור</w:t>
-            </w:r>
-          </w:p>
-        </w:tc>
-        <w:tc>
-          <w:tcPr>
-            <w:tcW w:type="dxa" w:w="2351"/>
-          </w:tcPr>
-          <w:p>
-            <w:r>
-              <w:rPr>
-                <w:rFonts w:ascii="Consolas" w:hAnsi="Consolas"/>
-                <w:b/>
-                <w:sz w:val="17"/>
-              </w:rPr>
-              <w:t>קשר</w:t>
+              <w:t>FK</w:t>
             </w:r>
           </w:p>
         </w:tc>
@@ -3828,7 +2569,7 @@
                 <w:rFonts w:ascii="Consolas" w:hAnsi="Consolas"/>
                 <w:sz w:val="16"/>
               </w:rPr>
-              <w:t>מספר רישוי</w:t>
+              <w:t>Plate number</w:t>
             </w:r>
           </w:p>
         </w:tc>
@@ -3885,7 +2626,7 @@
                 <w:rFonts w:ascii="Consolas" w:hAnsi="Consolas"/>
                 <w:sz w:val="16"/>
               </w:rPr>
-              <w:t>ספק בעלים</w:t>
+              <w:t>Owner supplier</w:t>
             </w:r>
           </w:p>
         </w:tc>
@@ -3899,64 +2640,7 @@
                 <w:rFonts w:ascii="Consolas" w:hAnsi="Consolas"/>
                 <w:sz w:val="16"/>
               </w:rPr>
-              <w:t>→ suppliers.id</w:t>
-            </w:r>
-          </w:p>
-        </w:tc>
-      </w:tr>
-      <w:tr>
-        <w:tc>
-          <w:tcPr>
-            <w:tcW w:type="dxa" w:w="2351"/>
-          </w:tcPr>
-          <w:p>
-            <w:r>
-              <w:rPr>
-                <w:rFonts w:ascii="Consolas" w:hAnsi="Consolas"/>
-                <w:sz w:val="16"/>
-              </w:rPr>
-              <w:t>supplier_equipment.license_plate</w:t>
-            </w:r>
-          </w:p>
-        </w:tc>
-        <w:tc>
-          <w:tcPr>
-            <w:tcW w:type="dxa" w:w="2351"/>
-          </w:tcPr>
-          <w:p>
-            <w:r>
-              <w:rPr>
-                <w:rFonts w:ascii="Consolas" w:hAnsi="Consolas"/>
-                <w:sz w:val="16"/>
-              </w:rPr>
-              <w:t>varchar</w:t>
-            </w:r>
-          </w:p>
-        </w:tc>
-        <w:tc>
-          <w:tcPr>
-            <w:tcW w:type="dxa" w:w="2351"/>
-          </w:tcPr>
-          <w:p>
-            <w:r>
-              <w:rPr>
-                <w:rFonts w:ascii="Consolas" w:hAnsi="Consolas"/>
-                <w:sz w:val="16"/>
-              </w:rPr>
-              <w:t>רישוי (ספק)</w:t>
-            </w:r>
-          </w:p>
-        </w:tc>
-        <w:tc>
-          <w:tcPr>
-            <w:tcW w:type="dxa" w:w="2351"/>
-          </w:tcPr>
-          <w:p>
-            <w:r>
-              <w:rPr>
-                <w:rFonts w:ascii="Consolas" w:hAnsi="Consolas"/>
-                <w:sz w:val="16"/>
-              </w:rPr>
+              <w:t>suppliers.id</w:t>
             </w:r>
           </w:p>
         </w:tc>
@@ -3986,7 +2670,7 @@
                 <w:rFonts w:ascii="Consolas" w:hAnsi="Consolas"/>
                 <w:sz w:val="16"/>
               </w:rPr>
-              <w:t>integer NOT NULL</w:t>
+              <w:t>integer</w:t>
             </w:r>
           </w:p>
         </w:tc>
@@ -4000,7 +2684,7 @@
                 <w:rFonts w:ascii="Consolas" w:hAnsi="Consolas"/>
                 <w:sz w:val="16"/>
               </w:rPr>
-              <w:t>כלי שנסרק</w:t>
+              <w:t>Scanned equipment</w:t>
             </w:r>
           </w:p>
         </w:tc>
@@ -4014,7 +2698,7 @@
                 <w:rFonts w:ascii="Consolas" w:hAnsi="Consolas"/>
                 <w:sz w:val="16"/>
               </w:rPr>
-              <w:t>→ equipment.id</w:t>
+              <w:t>equipment.id</w:t>
             </w:r>
           </w:p>
         </w:tc>
@@ -4058,7 +2742,7 @@
                 <w:rFonts w:ascii="Consolas" w:hAnsi="Consolas"/>
                 <w:sz w:val="16"/>
               </w:rPr>
-              <w:t>הזמנה</w:t>
+              <w:t>Work order</w:t>
             </w:r>
           </w:p>
         </w:tc>
@@ -4072,65 +2756,7 @@
                 <w:rFonts w:ascii="Consolas" w:hAnsi="Consolas"/>
                 <w:sz w:val="16"/>
               </w:rPr>
-              <w:t>→ work_orders.id</w:t>
-            </w:r>
-          </w:p>
-        </w:tc>
-      </w:tr>
-      <w:tr>
-        <w:tc>
-          <w:tcPr>
-            <w:tcW w:type="dxa" w:w="2351"/>
-          </w:tcPr>
-          <w:p>
-            <w:r>
-              <w:rPr>
-                <w:rFonts w:ascii="Consolas" w:hAnsi="Consolas"/>
-                <w:sz w:val="16"/>
-              </w:rPr>
-              <w:t>equipment_scans.scanned_by</w:t>
-            </w:r>
-          </w:p>
-        </w:tc>
-        <w:tc>
-          <w:tcPr>
-            <w:tcW w:type="dxa" w:w="2351"/>
-          </w:tcPr>
-          <w:p>
-            <w:r>
-              <w:rPr>
-                <w:rFonts w:ascii="Consolas" w:hAnsi="Consolas"/>
-                <w:sz w:val="16"/>
-              </w:rPr>
-              <w:t>integer</w:t>
-            </w:r>
-          </w:p>
-        </w:tc>
-        <w:tc>
-          <w:tcPr>
-            <w:tcW w:type="dxa" w:w="2351"/>
-          </w:tcPr>
-          <w:p>
-            <w:r>
-              <w:rPr>
-                <w:rFonts w:ascii="Consolas" w:hAnsi="Consolas"/>
-                <w:sz w:val="16"/>
-              </w:rPr>
-              <w:t>מי ביצע</w:t>
-            </w:r>
-          </w:p>
-        </w:tc>
-        <w:tc>
-          <w:tcPr>
-            <w:tcW w:type="dxa" w:w="2351"/>
-          </w:tcPr>
-          <w:p>
-            <w:r>
-              <w:rPr>
-                <w:rFonts w:ascii="Consolas" w:hAnsi="Consolas"/>
-                <w:sz w:val="16"/>
-              </w:rPr>
-              <w:t>→ users.id</w:t>
+              <w:t>work_orders.id</w:t>
             </w:r>
           </w:p>
         </w:tc>
@@ -4174,64 +2800,7 @@
                 <w:rFonts w:ascii="Consolas" w:hAnsi="Consolas"/>
                 <w:sz w:val="16"/>
               </w:rPr>
-              <w:t>תוצאת אימות</w:t>
-            </w:r>
-          </w:p>
-        </w:tc>
-        <w:tc>
-          <w:tcPr>
-            <w:tcW w:type="dxa" w:w="2351"/>
-          </w:tcPr>
-          <w:p>
-            <w:r>
-              <w:rPr>
-                <w:rFonts w:ascii="Consolas" w:hAnsi="Consolas"/>
-                <w:sz w:val="16"/>
-              </w:rPr>
-            </w:r>
-          </w:p>
-        </w:tc>
-      </w:tr>
-      <w:tr>
-        <w:tc>
-          <w:tcPr>
-            <w:tcW w:type="dxa" w:w="2351"/>
-          </w:tcPr>
-          <w:p>
-            <w:r>
-              <w:rPr>
-                <w:rFonts w:ascii="Consolas" w:hAnsi="Consolas"/>
-                <w:sz w:val="16"/>
-              </w:rPr>
-              <w:t>equipment_scans.scan_timestamp</w:t>
-            </w:r>
-          </w:p>
-        </w:tc>
-        <w:tc>
-          <w:tcPr>
-            <w:tcW w:type="dxa" w:w="2351"/>
-          </w:tcPr>
-          <w:p>
-            <w:r>
-              <w:rPr>
-                <w:rFonts w:ascii="Consolas" w:hAnsi="Consolas"/>
-                <w:sz w:val="16"/>
-              </w:rPr>
-              <w:t>timestamp</w:t>
-            </w:r>
-          </w:p>
-        </w:tc>
-        <w:tc>
-          <w:tcPr>
-            <w:tcW w:type="dxa" w:w="2351"/>
-          </w:tcPr>
-          <w:p>
-            <w:r>
-              <w:rPr>
-                <w:rFonts w:ascii="Consolas" w:hAnsi="Consolas"/>
-                <w:sz w:val="16"/>
-              </w:rPr>
-              <w:t>זמן אימות</w:t>
+              <w:t>Validation result</w:t>
             </w:r>
           </w:p>
         </w:tc>
@@ -4271,7 +2840,7 @@
                     <pic:cNvPicPr/>
                   </pic:nvPicPr>
                   <pic:blipFill>
-                    <a:blip r:embed="rId13"/>
+                    <a:blip r:embed="rId20"/>
                     <a:stretch>
                       <a:fillRect/>
                     </a:stretch>
@@ -4299,30 +2868,20 @@
           <w:i/>
           <w:sz w:val="18"/>
         </w:rPr>
-        <w:t>DB: טבלת equipment_scans — רשומות אימות</w:t>
+        <w:t>DB: equipment_scans validation records</w:t>
       </w:r>
     </w:p>
     <w:p>
       <w:pPr>
-        <w:pStyle w:val="Heading3"/>
-        <w:jc w:val="right"/>
-      </w:pPr>
-      <w:r>
-        <w:t>סיכום תהליך</w:t>
-      </w:r>
-    </w:p>
-    <w:p>
-      <w:pPr>
         <w:jc w:val="right"/>
         <w:bidi/>
       </w:pPr>
       <w:r>
         <w:rPr>
-          <w:b w:val="0"/>
-          <w:i w:val="0"/>
+          <w:b/>
           <w:sz w:val="22"/>
         </w:rPr>
-        <w:t>תהליך האימות מבטיח שהכלי שמגיע לשטח הוא בדיוק הכלי שאושר בהזמנה. כל אימות מתועד ב-equipment_scans ויוצר שרשרת ביקורת מלאה, ומונע חיוב על ציוד שלא סופק בפועל.</w:t>
+        <w:t>Every validation is recorded in equipment_scans, creating a complete audit trail. This prevents billing for equipment that was not actually supplied.</w:t>
       </w:r>
     </w:p>
     <w:p>
@@ -4336,136 +2895,29 @@
         <w:jc w:val="right"/>
       </w:pPr>
       <w:r>
-        <w:t>תהליך 3: דיווח שעות → אישור → חשבונית</w:t>
+        <w:t>Process 3: Worklog &gt; Approval &gt; Invoice</w:t>
       </w:r>
     </w:p>
     <w:p>
       <w:pPr>
-        <w:pStyle w:val="Heading3"/>
         <w:jc w:val="right"/>
+        <w:bidi/>
       </w:pPr>
       <w:r>
-        <w:t>למה התהליך הזה קריטי</w:t>
+        <w:rPr>
+          <w:b/>
+          <w:sz w:val="22"/>
+        </w:rPr>
+        <w:t>The financial control process. Every payment requires: (1) field report, (2) accountant approval with self-approval blocked, (3) formal invoice with enforced state machine DRAFT &gt; APPROVED &gt; PAID. Budget updates automatically on each approval.</w:t>
       </w:r>
     </w:p>
     <w:p>
       <w:pPr>
-        <w:jc w:val="right"/>
-        <w:bidi/>
-      </w:pPr>
-      <w:r>
-        <w:rPr>
-          <w:b w:val="0"/>
-          <w:i w:val="0"/>
-          <w:sz w:val="22"/>
-        </w:rPr>
-        <w:t>זהו התהליך שבו כסף עובר ידיים. ללא בקרה הדוקה, שעות מנופחות ואישורים עצמיים יכולים לגרום להפסדים. תהליך זה מבטיח שכל שקל שמשולם עבר דיווח מסודר, אישור מנהלת חשבונות מוסמכת, ויצירת חשבונית רשמית — ללא אפשרות לדלג על שלבים.</w:t>
-      </w:r>
-    </w:p>
-    <w:p>
-      <w:pPr>
         <w:pStyle w:val="Heading3"/>
         <w:jc w:val="right"/>
       </w:pPr>
       <w:r>
-        <w:t>קבצי Frontend</w:t>
-      </w:r>
-    </w:p>
-    <w:p>
-      <w:pPr>
-        <w:pStyle w:val="ListBullet"/>
-        <w:jc w:val="right"/>
-        <w:bidi/>
-      </w:pPr>
-      <w:r>
-        <w:rPr>
-          <w:sz w:val="21"/>
-        </w:rPr>
-        <w:t>app_frontend/src/pages/WorkLogs/WorklogFormUnified.tsx — טופס דיווח שעות</w:t>
-      </w:r>
-    </w:p>
-    <w:p>
-      <w:pPr>
-        <w:pStyle w:val="ListBullet"/>
-        <w:jc w:val="right"/>
-        <w:bidi/>
-      </w:pPr>
-      <w:r>
-        <w:rPr>
-          <w:sz w:val="21"/>
-        </w:rPr>
-        <w:t>app_frontend/src/pages/WorkLogs/AccountantInbox.tsx — תיבת אישור חשבונאית</w:t>
-      </w:r>
-    </w:p>
-    <w:p>
-      <w:pPr>
-        <w:pStyle w:val="Heading3"/>
-        <w:jc w:val="right"/>
-      </w:pPr>
-      <w:r>
-        <w:t>קבצי Backend</w:t>
-      </w:r>
-    </w:p>
-    <w:p>
-      <w:pPr>
-        <w:pStyle w:val="ListBullet"/>
-        <w:jc w:val="right"/>
-        <w:bidi/>
-      </w:pPr>
-      <w:r>
-        <w:rPr>
-          <w:sz w:val="21"/>
-        </w:rPr>
-        <w:t>app_backend/app/services/worklog_service.py — יצירה + אישור דיווח</w:t>
-      </w:r>
-    </w:p>
-    <w:p>
-      <w:pPr>
-        <w:pStyle w:val="ListBullet"/>
-        <w:jc w:val="right"/>
-        <w:bidi/>
-      </w:pPr>
-      <w:r>
-        <w:rPr>
-          <w:sz w:val="21"/>
-        </w:rPr>
-        <w:t>app_backend/app/services/invoice_service.py — יצירת חשבונית</w:t>
-      </w:r>
-    </w:p>
-    <w:p>
-      <w:pPr>
-        <w:pStyle w:val="ListBullet"/>
-        <w:jc w:val="right"/>
-        <w:bidi/>
-      </w:pPr>
-      <w:r>
-        <w:rPr>
-          <w:sz w:val="21"/>
-        </w:rPr>
-        <w:t>app_backend/app/routers/worklogs.py — API endpoints</w:t>
-      </w:r>
-    </w:p>
-    <w:p>
-      <w:pPr>
-        <w:pStyle w:val="Heading3"/>
-        <w:jc w:val="right"/>
-      </w:pPr>
-      <w:r>
-        <w:t>קטע קוד — יצירת דיווח שעות</w:t>
-      </w:r>
-    </w:p>
-    <w:p>
-      <w:pPr>
-        <w:jc w:val="left"/>
-        <w:shd w:val="clear" w:color="auto" w:fill="1E1E2E"/>
-      </w:pPr>
-      <w:r>
-        <w:rPr>
-          <w:rFonts w:ascii="Consolas" w:hAnsi="Consolas"/>
-          <w:color w:val="D4D4D4"/>
-          <w:sz w:val="15"/>
-        </w:rPr>
-        <w:t># app_backend/app/services/worklog_service.py</w:t>
+        <w:t>Backend: app_backend/app/services/worklog_service.py</w:t>
       </w:r>
     </w:p>
     <w:p>
@@ -4507,49 +2959,7 @@
           <w:color w:val="D4D4D4"/>
           <w:sz w:val="15"/>
         </w:rPr>
-        <w:t xml:space="preserve">    if not wo:</w:t>
-      </w:r>
-    </w:p>
-    <w:p>
-      <w:pPr>
-        <w:jc w:val="left"/>
-        <w:shd w:val="clear" w:color="auto" w:fill="1E1E2E"/>
-      </w:pPr>
-      <w:r>
-        <w:rPr>
-          <w:rFonts w:ascii="Consolas" w:hAnsi="Consolas"/>
-          <w:color w:val="D4D4D4"/>
-          <w:sz w:val="15"/>
-        </w:rPr>
-        <w:t xml:space="preserve">        raise ValidationException("Work order not found")</w:t>
-      </w:r>
-    </w:p>
-    <w:p>
-      <w:pPr>
-        <w:jc w:val="left"/>
-        <w:shd w:val="clear" w:color="auto" w:fill="1E1E2E"/>
-      </w:pPr>
-      <w:r>
-        <w:rPr>
-          <w:rFonts w:ascii="Consolas" w:hAnsi="Consolas"/>
-          <w:color w:val="D4D4D4"/>
-          <w:sz w:val="15"/>
-        </w:rPr>
-        <w:t xml:space="preserve"> </w:t>
-      </w:r>
-    </w:p>
-    <w:p>
-      <w:pPr>
-        <w:jc w:val="left"/>
-        <w:shd w:val="clear" w:color="auto" w:fill="1E1E2E"/>
-      </w:pPr>
-      <w:r>
-        <w:rPr>
-          <w:rFonts w:ascii="Consolas" w:hAnsi="Consolas"/>
-          <w:color w:val="D4D4D4"/>
-          <w:sz w:val="15"/>
-        </w:rPr>
-        <w:t xml:space="preserve">    # Snapshot rate at time of report — prevents retroactive changes</w:t>
+        <w:t xml:space="preserve">    if not wo: raise ValidationException("Work order not found")</w:t>
       </w:r>
     </w:p>
     <w:p>
@@ -4577,7 +2987,7 @@
           <w:color w:val="D4D4D4"/>
           <w:sz w:val="15"/>
         </w:rPr>
-        <w:t xml:space="preserve">    worklog_dict['cost_before_vat']      = work_hours * hourly_rate</w:t>
+        <w:t xml:space="preserve">    worklog_dict['cost_before_vat'] = work_hours * hourly_rate</w:t>
       </w:r>
     </w:p>
     <w:p>
@@ -4591,7 +3001,7 @@
           <w:color w:val="D4D4D4"/>
           <w:sz w:val="15"/>
         </w:rPr>
-        <w:t xml:space="preserve">    worklog_dict['cost_with_vat']        = cost_before_vat * Decimal('1.17')</w:t>
+        <w:t xml:space="preserve">    worklog_dict['cost_with_vat'] = cost_before_vat * Decimal('1.17')</w:t>
       </w:r>
     </w:p>
     <w:p>
@@ -4639,29 +3049,6 @@
     <w:p/>
     <w:p>
       <w:pPr>
-        <w:pStyle w:val="Heading3"/>
-        <w:jc w:val="right"/>
-      </w:pPr>
-      <w:r>
-        <w:t>קטע קוד — אישור דיווח + עדכון תקציב</w:t>
-      </w:r>
-    </w:p>
-    <w:p>
-      <w:pPr>
-        <w:jc w:val="left"/>
-        <w:shd w:val="clear" w:color="auto" w:fill="1E1E2E"/>
-      </w:pPr>
-      <w:r>
-        <w:rPr>
-          <w:rFonts w:ascii="Consolas" w:hAnsi="Consolas"/>
-          <w:color w:val="D4D4D4"/>
-          <w:sz w:val="15"/>
-        </w:rPr>
-        <w:t># app_backend/app/services/worklog_service.py</w:t>
-      </w:r>
-    </w:p>
-    <w:p>
-      <w:pPr>
         <w:jc w:val="left"/>
         <w:shd w:val="clear" w:color="auto" w:fill="1E1E2E"/>
       </w:pPr>
@@ -4714,48 +3101,6 @@
           <w:sz w:val="15"/>
         </w:rPr>
         <w:t xml:space="preserve">    worklog.approved_at = datetime.utcnow()</w:t>
-      </w:r>
-    </w:p>
-    <w:p>
-      <w:pPr>
-        <w:jc w:val="left"/>
-        <w:shd w:val="clear" w:color="auto" w:fill="1E1E2E"/>
-      </w:pPr>
-      <w:r>
-        <w:rPr>
-          <w:rFonts w:ascii="Consolas" w:hAnsi="Consolas"/>
-          <w:color w:val="D4D4D4"/>
-          <w:sz w:val="15"/>
-        </w:rPr>
-        <w:t xml:space="preserve">    db.commit()</w:t>
-      </w:r>
-    </w:p>
-    <w:p>
-      <w:pPr>
-        <w:jc w:val="left"/>
-        <w:shd w:val="clear" w:color="auto" w:fill="1E1E2E"/>
-      </w:pPr>
-      <w:r>
-        <w:rPr>
-          <w:rFonts w:ascii="Consolas" w:hAnsi="Consolas"/>
-          <w:color w:val="D4D4D4"/>
-          <w:sz w:val="15"/>
-        </w:rPr>
-        <w:t xml:space="preserve"> </w:t>
-      </w:r>
-    </w:p>
-    <w:p>
-      <w:pPr>
-        <w:jc w:val="left"/>
-        <w:shd w:val="clear" w:color="auto" w:fill="1E1E2E"/>
-      </w:pPr>
-      <w:r>
-        <w:rPr>
-          <w:rFonts w:ascii="Consolas" w:hAnsi="Consolas"/>
-          <w:color w:val="D4D4D4"/>
-          <w:sz w:val="15"/>
-        </w:rPr>
-        <w:t xml:space="preserve">    # Atomic budget update on every approval</w:t>
       </w:r>
     </w:p>
     <w:p>
@@ -4807,21 +3152,7 @@
         <w:jc w:val="right"/>
       </w:pPr>
       <w:r>
-        <w:t>קטע קוד — יצירת חשבונית (מנהלת חשבונות)</w:t>
-      </w:r>
-    </w:p>
-    <w:p>
-      <w:pPr>
-        <w:jc w:val="left"/>
-        <w:shd w:val="clear" w:color="auto" w:fill="1E1E2E"/>
-      </w:pPr>
-      <w:r>
-        <w:rPr>
-          <w:rFonts w:ascii="Consolas" w:hAnsi="Consolas"/>
-          <w:color w:val="D4D4D4"/>
-          <w:sz w:val="15"/>
-        </w:rPr>
-        <w:t># app_backend/app/services/invoice_service.py</w:t>
+        <w:t>Backend: app_backend/app/services/invoice_service.py</w:t>
       </w:r>
     </w:p>
     <w:p>
@@ -4849,20 +3180,6 @@
           <w:color w:val="D4D4D4"/>
           <w:sz w:val="15"/>
         </w:rPr>
-        <w:t xml:space="preserve">    # Auto-generate sequential number: INV-2026-0001</w:t>
-      </w:r>
-    </w:p>
-    <w:p>
-      <w:pPr>
-        <w:jc w:val="left"/>
-        <w:shd w:val="clear" w:color="auto" w:fill="1E1E2E"/>
-      </w:pPr>
-      <w:r>
-        <w:rPr>
-          <w:rFonts w:ascii="Consolas" w:hAnsi="Consolas"/>
-          <w:color w:val="D4D4D4"/>
-          <w:sz w:val="15"/>
-        </w:rPr>
         <w:t xml:space="preserve">    seq = last_seq + 1</w:t>
       </w:r>
     </w:p>
@@ -4891,35 +3208,7 @@
           <w:color w:val="D4D4D4"/>
           <w:sz w:val="15"/>
         </w:rPr>
-        <w:t xml:space="preserve"> </w:t>
-      </w:r>
-    </w:p>
-    <w:p>
-      <w:pPr>
-        <w:jc w:val="left"/>
-        <w:shd w:val="clear" w:color="auto" w:fill="1E1E2E"/>
-      </w:pPr>
-      <w:r>
-        <w:rPr>
-          <w:rFonts w:ascii="Consolas" w:hAnsi="Consolas"/>
-          <w:color w:val="D4D4D4"/>
-          <w:sz w:val="15"/>
-        </w:rPr>
-        <w:t xml:space="preserve">    # Auto-calculate VAT 17% + 30-day payment term</w:t>
-      </w:r>
-    </w:p>
-    <w:p>
-      <w:pPr>
-        <w:jc w:val="left"/>
-        <w:shd w:val="clear" w:color="auto" w:fill="1E1E2E"/>
-      </w:pPr>
-      <w:r>
-        <w:rPr>
-          <w:rFonts w:ascii="Consolas" w:hAnsi="Consolas"/>
-          <w:color w:val="D4D4D4"/>
-          <w:sz w:val="15"/>
-        </w:rPr>
-        <w:t xml:space="preserve">    invoice_dict['subtotal']   = total / Decimal('1.17')</w:t>
+        <w:t xml:space="preserve">    invoice_dict['subtotal'] = total / Decimal('1.17')</w:t>
       </w:r>
     </w:p>
     <w:p>
@@ -4947,7 +3236,7 @@
           <w:color w:val="D4D4D4"/>
           <w:sz w:val="15"/>
         </w:rPr>
-        <w:t xml:space="preserve">    invoice_dict['due_date']   = issue_date + timedelta(days=30)</w:t>
+        <w:t xml:space="preserve">    invoice_dict['due_date'] = issue_date + timedelta(days=30)</w:t>
       </w:r>
     </w:p>
     <w:p>
@@ -4961,7 +3250,7 @@
           <w:color w:val="D4D4D4"/>
           <w:sz w:val="15"/>
         </w:rPr>
-        <w:t xml:space="preserve">    invoice_dict['status']     = 'DRAFT'</w:t>
+        <w:t xml:space="preserve">    invoice_dict['status'] = 'DRAFT'</w:t>
       </w:r>
     </w:p>
     <w:p>
@@ -4993,15 +3282,6 @@
       </w:r>
     </w:p>
     <w:p/>
-    <w:p>
-      <w:pPr>
-        <w:pStyle w:val="Heading3"/>
-        <w:jc w:val="right"/>
-      </w:pPr>
-      <w:r>
-        <w:t>זרימה</w:t>
-      </w:r>
-    </w:p>
     <w:tbl>
       <w:tblPr>
         <w:tblStyle w:val="TableGrid"/>
@@ -5028,7 +3308,7 @@
                 <w:b/>
                 <w:sz w:val="17"/>
               </w:rPr>
-              <w:t>שלב</w:t>
+              <w:t>Step</w:t>
             </w:r>
           </w:p>
         </w:tc>
@@ -5043,7 +3323,7 @@
                 <w:b/>
                 <w:sz w:val="17"/>
               </w:rPr>
-              <w:t>שחקן</w:t>
+              <w:t>Actor</w:t>
             </w:r>
           </w:p>
         </w:tc>
@@ -5058,7 +3338,7 @@
                 <w:b/>
                 <w:sz w:val="17"/>
               </w:rPr>
-              <w:t>פעולה</w:t>
+              <w:t>Action</w:t>
             </w:r>
           </w:p>
         </w:tc>
@@ -5073,7 +3353,7 @@
                 <w:b/>
                 <w:sz w:val="17"/>
               </w:rPr>
-              <w:t>סטטוס</w:t>
+              <w:t>Status</w:t>
             </w:r>
           </w:p>
         </w:tc>
@@ -5088,7 +3368,7 @@
                 <w:b/>
                 <w:sz w:val="17"/>
               </w:rPr>
-              <w:t>השפעה כספית</w:t>
+              <w:t>Financial</w:t>
             </w:r>
           </w:p>
         </w:tc>
@@ -5118,7 +3398,7 @@
                 <w:rFonts w:ascii="Consolas" w:hAnsi="Consolas"/>
                 <w:sz w:val="16"/>
               </w:rPr>
-              <w:t>מנהל עבודה</w:t>
+              <w:t>Work Manager</w:t>
             </w:r>
           </w:p>
         </w:tc>
@@ -5132,7 +3412,7 @@
                 <w:rFonts w:ascii="Consolas" w:hAnsi="Consolas"/>
                 <w:sz w:val="16"/>
               </w:rPr>
-              <w:t>יוצר דיווח</w:t>
+              <w:t>Create report</w:t>
             </w:r>
           </w:p>
         </w:tc>
@@ -5160,7 +3440,6 @@
                 <w:rFonts w:ascii="Consolas" w:hAnsi="Consolas"/>
                 <w:sz w:val="16"/>
               </w:rPr>
-              <w:t>אין</w:t>
             </w:r>
           </w:p>
         </w:tc>
@@ -5190,7 +3469,7 @@
                 <w:rFonts w:ascii="Consolas" w:hAnsi="Consolas"/>
                 <w:sz w:val="16"/>
               </w:rPr>
-              <w:t>מנהל עבודה</w:t>
+              <w:t>Work Manager</w:t>
             </w:r>
           </w:p>
         </w:tc>
@@ -5204,7 +3483,7 @@
                 <w:rFonts w:ascii="Consolas" w:hAnsi="Consolas"/>
                 <w:sz w:val="16"/>
               </w:rPr>
-              <w:t>שולח לאישור</w:t>
+              <w:t>Submit</w:t>
             </w:r>
           </w:p>
         </w:tc>
@@ -5232,7 +3511,6 @@
                 <w:rFonts w:ascii="Consolas" w:hAnsi="Consolas"/>
                 <w:sz w:val="16"/>
               </w:rPr>
-              <w:t>אין</w:t>
             </w:r>
           </w:p>
         </w:tc>
@@ -5262,7 +3540,7 @@
                 <w:rFonts w:ascii="Consolas" w:hAnsi="Consolas"/>
                 <w:sz w:val="16"/>
               </w:rPr>
-              <w:t>מנהלת חשבונות</w:t>
+              <w:t>Accountant</w:t>
             </w:r>
           </w:p>
         </w:tc>
@@ -5276,7 +3554,7 @@
                 <w:rFonts w:ascii="Consolas" w:hAnsi="Consolas"/>
                 <w:sz w:val="16"/>
               </w:rPr>
-              <w:t>מאשרת</w:t>
+              <w:t>Approve</w:t>
             </w:r>
           </w:p>
         </w:tc>
@@ -5334,7 +3612,7 @@
                 <w:rFonts w:ascii="Consolas" w:hAnsi="Consolas"/>
                 <w:sz w:val="16"/>
               </w:rPr>
-              <w:t>מנהלת חשבונות</w:t>
+              <w:t>Accountant</w:t>
             </w:r>
           </w:p>
         </w:tc>
@@ -5348,7 +3626,7 @@
                 <w:rFonts w:ascii="Consolas" w:hAnsi="Consolas"/>
                 <w:sz w:val="16"/>
               </w:rPr>
-              <w:t>יוצרת חשבונית</w:t>
+              <w:t>Create invoice</w:t>
             </w:r>
           </w:p>
         </w:tc>
@@ -5376,7 +3654,7 @@
                 <w:rFonts w:ascii="Consolas" w:hAnsi="Consolas"/>
                 <w:sz w:val="16"/>
               </w:rPr>
-              <w:t>INV-YYYY-NNNN + מע"מ</w:t>
+              <w:t>INV-YYYY-NNNN + VAT 17%</w:t>
             </w:r>
           </w:p>
         </w:tc>
@@ -5406,7 +3684,7 @@
                 <w:rFonts w:ascii="Consolas" w:hAnsi="Consolas"/>
                 <w:sz w:val="16"/>
               </w:rPr>
-              <w:t>מנהלת חשבונות</w:t>
+              <w:t>Accountant</w:t>
             </w:r>
           </w:p>
         </w:tc>
@@ -5420,7 +3698,7 @@
                 <w:rFonts w:ascii="Consolas" w:hAnsi="Consolas"/>
                 <w:sz w:val="16"/>
               </w:rPr>
-              <w:t>מאשרת חשבונית</w:t>
+              <w:t>Approve invoice</w:t>
             </w:r>
           </w:p>
         </w:tc>
@@ -5448,7 +3726,6 @@
                 <w:rFonts w:ascii="Consolas" w:hAnsi="Consolas"/>
                 <w:sz w:val="16"/>
               </w:rPr>
-              <w:t>—</w:t>
             </w:r>
           </w:p>
         </w:tc>
@@ -5478,7 +3755,7 @@
                 <w:rFonts w:ascii="Consolas" w:hAnsi="Consolas"/>
                 <w:sz w:val="16"/>
               </w:rPr>
-              <w:t>מנהלת חשבונות</w:t>
+              <w:t>Accountant</w:t>
             </w:r>
           </w:p>
         </w:tc>
@@ -5492,7 +3769,7 @@
                 <w:rFonts w:ascii="Consolas" w:hAnsi="Consolas"/>
                 <w:sz w:val="16"/>
               </w:rPr>
-              <w:t>מסמנת כשולם</w:t>
+              <w:t>Mark paid</w:t>
             </w:r>
           </w:p>
         </w:tc>
@@ -5520,22 +3797,13 @@
                 <w:rFonts w:ascii="Consolas" w:hAnsi="Consolas"/>
                 <w:sz w:val="16"/>
               </w:rPr>
-              <w:t>סיום מחזור כספי</w:t>
+              <w:t>Cycle complete</w:t>
             </w:r>
           </w:p>
         </w:tc>
       </w:tr>
     </w:tbl>
     <w:p/>
-    <w:p>
-      <w:pPr>
-        <w:pStyle w:val="Heading3"/>
-        <w:jc w:val="right"/>
-      </w:pPr>
-      <w:r>
-        <w:t>מסד נתונים — worklogs + invoices + budgets</w:t>
-      </w:r>
-    </w:p>
     <w:tbl>
       <w:tblPr>
         <w:tblStyle w:val="TableGrid"/>
@@ -5560,7 +3828,7 @@
                 <w:b/>
                 <w:sz w:val="17"/>
               </w:rPr>
-              <w:t>טבלה.שדה</w:t>
+              <w:t>Field</w:t>
             </w:r>
           </w:p>
         </w:tc>
@@ -5575,7 +3843,7 @@
                 <w:b/>
                 <w:sz w:val="17"/>
               </w:rPr>
-              <w:t>סוג</w:t>
+              <w:t>Type</w:t>
             </w:r>
           </w:p>
         </w:tc>
@@ -5590,51 +3858,7 @@
                 <w:b/>
                 <w:sz w:val="17"/>
               </w:rPr>
-              <w:t>תיאור</w:t>
-            </w:r>
-          </w:p>
-        </w:tc>
-      </w:tr>
-      <w:tr>
-        <w:tc>
-          <w:tcPr>
-            <w:tcW w:type="dxa" w:w="3135"/>
-          </w:tcPr>
-          <w:p>
-            <w:r>
-              <w:rPr>
-                <w:rFonts w:ascii="Consolas" w:hAnsi="Consolas"/>
-                <w:sz w:val="16"/>
-              </w:rPr>
-              <w:t>worklogs.work_order_id</w:t>
-            </w:r>
-          </w:p>
-        </w:tc>
-        <w:tc>
-          <w:tcPr>
-            <w:tcW w:type="dxa" w:w="3135"/>
-          </w:tcPr>
-          <w:p>
-            <w:r>
-              <w:rPr>
-                <w:rFonts w:ascii="Consolas" w:hAnsi="Consolas"/>
-                <w:sz w:val="16"/>
-              </w:rPr>
-              <w:t>integer</w:t>
-            </w:r>
-          </w:p>
-        </w:tc>
-        <w:tc>
-          <w:tcPr>
-            <w:tcW w:type="dxa" w:w="3135"/>
-          </w:tcPr>
-          <w:p>
-            <w:r>
-              <w:rPr>
-                <w:rFonts w:ascii="Consolas" w:hAnsi="Consolas"/>
-                <w:sz w:val="16"/>
-              </w:rPr>
-              <w:t>→ work_orders.id</w:t>
+              <w:t>Description</w:t>
             </w:r>
           </w:p>
         </w:tc>
@@ -5678,7 +3902,7 @@
                 <w:rFonts w:ascii="Consolas" w:hAnsi="Consolas"/>
                 <w:sz w:val="16"/>
               </w:rPr>
-              <w:t>תעריף נקפא בדיווח</w:t>
+              <w:t>Rate frozen at report time</w:t>
             </w:r>
           </w:p>
         </w:tc>
@@ -5722,7 +3946,7 @@
                 <w:rFonts w:ascii="Consolas" w:hAnsi="Consolas"/>
                 <w:sz w:val="16"/>
               </w:rPr>
-              <w:t>עלות כולל מע"מ</w:t>
+              <w:t>Cost including 17% VAT</w:t>
             </w:r>
           </w:p>
         </w:tc>
@@ -5766,51 +3990,7 @@
                 <w:rFonts w:ascii="Consolas" w:hAnsi="Consolas"/>
                 <w:sz w:val="16"/>
               </w:rPr>
-              <w:t>PENDING→SUBMITTED→APPROVED</w:t>
-            </w:r>
-          </w:p>
-        </w:tc>
-      </w:tr>
-      <w:tr>
-        <w:tc>
-          <w:tcPr>
-            <w:tcW w:type="dxa" w:w="3135"/>
-          </w:tcPr>
-          <w:p>
-            <w:r>
-              <w:rPr>
-                <w:rFonts w:ascii="Consolas" w:hAnsi="Consolas"/>
-                <w:sz w:val="16"/>
-              </w:rPr>
-              <w:t>worklogs.approved_by_user_id</w:t>
-            </w:r>
-          </w:p>
-        </w:tc>
-        <w:tc>
-          <w:tcPr>
-            <w:tcW w:type="dxa" w:w="3135"/>
-          </w:tcPr>
-          <w:p>
-            <w:r>
-              <w:rPr>
-                <w:rFonts w:ascii="Consolas" w:hAnsi="Consolas"/>
-                <w:sz w:val="16"/>
-              </w:rPr>
-              <w:t>integer</w:t>
-            </w:r>
-          </w:p>
-        </w:tc>
-        <w:tc>
-          <w:tcPr>
-            <w:tcW w:type="dxa" w:w="3135"/>
-          </w:tcPr>
-          <w:p>
-            <w:r>
-              <w:rPr>
-                <w:rFonts w:ascii="Consolas" w:hAnsi="Consolas"/>
-                <w:sz w:val="16"/>
-              </w:rPr>
-              <w:t>→ users.id</w:t>
+              <w:t>PENDING&gt;SUBMITTED&gt;APPROVED</w:t>
             </w:r>
           </w:p>
         </w:tc>
@@ -5840,7 +4020,7 @@
                 <w:rFonts w:ascii="Consolas" w:hAnsi="Consolas"/>
                 <w:sz w:val="16"/>
               </w:rPr>
-              <w:t>varchar NOT NULL</w:t>
+              <w:t>varchar</w:t>
             </w:r>
           </w:p>
         </w:tc>
@@ -5854,51 +4034,7 @@
                 <w:rFonts w:ascii="Consolas" w:hAnsi="Consolas"/>
                 <w:sz w:val="16"/>
               </w:rPr>
-              <w:t>INV-YYYY-NNNN</w:t>
-            </w:r>
-          </w:p>
-        </w:tc>
-      </w:tr>
-      <w:tr>
-        <w:tc>
-          <w:tcPr>
-            <w:tcW w:type="dxa" w:w="3135"/>
-          </w:tcPr>
-          <w:p>
-            <w:r>
-              <w:rPr>
-                <w:rFonts w:ascii="Consolas" w:hAnsi="Consolas"/>
-                <w:sz w:val="16"/>
-              </w:rPr>
-              <w:t>invoices.total_amount</w:t>
-            </w:r>
-          </w:p>
-        </w:tc>
-        <w:tc>
-          <w:tcPr>
-            <w:tcW w:type="dxa" w:w="3135"/>
-          </w:tcPr>
-          <w:p>
-            <w:r>
-              <w:rPr>
-                <w:rFonts w:ascii="Consolas" w:hAnsi="Consolas"/>
-                <w:sz w:val="16"/>
-              </w:rPr>
-              <w:t>numeric NOT NULL</w:t>
-            </w:r>
-          </w:p>
-        </w:tc>
-        <w:tc>
-          <w:tcPr>
-            <w:tcW w:type="dxa" w:w="3135"/>
-          </w:tcPr>
-          <w:p>
-            <w:r>
-              <w:rPr>
-                <w:rFonts w:ascii="Consolas" w:hAnsi="Consolas"/>
-                <w:sz w:val="16"/>
-              </w:rPr>
-              <w:t>סכום כולל</w:t>
+              <w:t>Auto: INV-YYYY-NNNN</w:t>
             </w:r>
           </w:p>
         </w:tc>
@@ -5928,7 +4064,7 @@
                 <w:rFonts w:ascii="Consolas" w:hAnsi="Consolas"/>
                 <w:sz w:val="16"/>
               </w:rPr>
-              <w:t>varchar NOT NULL</w:t>
+              <w:t>varchar</w:t>
             </w:r>
           </w:p>
         </w:tc>
@@ -5942,7 +4078,7 @@
                 <w:rFonts w:ascii="Consolas" w:hAnsi="Consolas"/>
                 <w:sz w:val="16"/>
               </w:rPr>
-              <w:t>DRAFT→APPROVED→PAID</w:t>
+              <w:t>DRAFT&gt;APPROVED&gt;PAID</w:t>
             </w:r>
           </w:p>
         </w:tc>
@@ -5986,7 +4122,7 @@
                 <w:rFonts w:ascii="Consolas" w:hAnsi="Consolas"/>
                 <w:sz w:val="16"/>
               </w:rPr>
-              <w:t>מתעדכן בכל אישור</w:t>
+              <w:t>Updated on each approval</w:t>
             </w:r>
           </w:p>
         </w:tc>
@@ -6013,7 +4149,7 @@
                     <pic:cNvPicPr/>
                   </pic:nvPicPr>
                   <pic:blipFill>
-                    <a:blip r:embed="rId14"/>
+                    <a:blip r:embed="rId21"/>
                     <a:stretch>
                       <a:fillRect/>
                     </a:stretch>
@@ -6041,30 +4177,20 @@
           <w:i/>
           <w:sz w:val="18"/>
         </w:rPr>
-        <w:t>DB: טבלת invoices לאחר אישור דיווחים</w:t>
+        <w:t>DB: invoices table after worklog approval</w:t>
       </w:r>
     </w:p>
     <w:p>
       <w:pPr>
-        <w:pStyle w:val="Heading3"/>
-        <w:jc w:val="right"/>
-      </w:pPr>
-      <w:r>
-        <w:t>סיכום תהליך</w:t>
-      </w:r>
-    </w:p>
-    <w:p>
-      <w:pPr>
         <w:jc w:val="right"/>
         <w:bidi/>
       </w:pPr>
       <w:r>
         <w:rPr>
-          <w:b w:val="0"/>
-          <w:i w:val="0"/>
+          <w:b/>
           <w:sz w:val="22"/>
         </w:rPr>
-        <w:t>תהליך זה מממש בקרה כספית מלאה עם הפרדת סמכויות: מנהל העבודה מדווח, מנהלת חשבונות מאשרת ויוצרת חשבונית. Self-approval חסום ברמת הקוד, מכונת המצבים קשיחה, והתקציב מתעדכן אוטומטית בכל אישור.</w:t>
+        <w:t>This process implements full financial control with separation of duties. Self-approval is blocked at code level, the state machine is strict, and the budget updates automatically on every approval.</w:t>
       </w:r>
     </w:p>
     <w:p>
@@ -6081,7 +4207,7 @@
         <w:rPr>
           <w:color w:val="1F6F43"/>
         </w:rPr>
-        <w:t>סיכום טכנולוגי</w:t>
+        <w:t>Technology Stack</w:t>
       </w:r>
     </w:p>
     <w:tbl>
@@ -6107,7 +4233,7 @@
                 <w:b/>
                 <w:sz w:val="17"/>
               </w:rPr>
-              <w:t>שכבה</w:t>
+              <w:t>Layer</w:t>
             </w:r>
           </w:p>
         </w:tc>
@@ -6122,7 +4248,7 @@
                 <w:b/>
                 <w:sz w:val="17"/>
               </w:rPr>
-              <w:t>טכנולוגיה</w:t>
+              <w:t>Technology</w:t>
             </w:r>
           </w:p>
         </w:tc>
@@ -6228,7 +4354,7 @@
                 <w:rFonts w:ascii="Consolas" w:hAnsi="Consolas"/>
                 <w:sz w:val="16"/>
               </w:rPr>
-              <w:t>Authentication</w:t>
+              <w:t>Auth</w:t>
             </w:r>
           </w:p>
         </w:tc>
@@ -6288,7 +4414,7 @@
                 <w:rFonts w:ascii="Consolas" w:hAnsi="Consolas"/>
                 <w:sz w:val="16"/>
               </w:rPr>
-              <w:t>Deployment</w:t>
+              <w:t>Deploy</w:t>
             </w:r>
           </w:p>
         </w:tc>
@@ -6332,7 +4458,7 @@
                 <w:rFonts w:ascii="Consolas" w:hAnsi="Consolas"/>
                 <w:sz w:val="16"/>
               </w:rPr>
-              <w:t>Sentry (error tracking), Loguru (structured logging)</w:t>
+              <w:t>Sentry (errors), Loguru (structured logging)</w:t>
             </w:r>
           </w:p>
         </w:tc>

</xml_diff>